<commit_message>
feat: update user guide with new interface details, enhance navigation structure, and improve clarity of instructions for course management
</commit_message>
<xml_diff>
--- a/docs/user-guide/Unet-LMS-rukovodstvo-prepodavatelya.docx
+++ b/docs/user-guide/Unet-LMS-rukovodstvo-prepodavatelya.docx
@@ -43,7 +43,7 @@
           <w:color w:val="464646"/>
           <w:sz w:val="24"/>
         </w:rPr>
-        <w:t>Как войти в систему, создать курс, добавить тему или тест и загрузить учебные материалы.</w:t>
+        <w:t>Актуальный интерфейс: вход, страница «Сегодня», курсы, темы, материалы, приглашения, тесты и коллекция вопросов.</w:t>
       </w:r>
     </w:p>
     <w:p>
@@ -58,7 +58,7 @@
           <w:color w:val="6E6E6E"/>
           <w:sz w:val="20"/>
         </w:rPr>
-        <w:t>Роль: преподаватель (профиль сотрудника UNET). Сентябрь 2026.</w:t>
+        <w:t>Роль: преподаватель (профиль сотрудника UNET). https://lms.kstu.kg · сентябрь 2026.</w:t>
       </w:r>
     </w:p>
     <w:p>
@@ -97,7 +97,7 @@
           <w:b w:val="0"/>
           <w:sz w:val="22"/>
         </w:rPr>
-        <w:t>2. Раздел «Мои курсы»</w:t>
+        <w:t>2. Страница «Сегодня»</w:t>
       </w:r>
     </w:p>
     <w:p>
@@ -110,7 +110,7 @@
           <w:b w:val="0"/>
           <w:sz w:val="22"/>
         </w:rPr>
-        <w:t>3. Как добавить курс</w:t>
+        <w:t>3. Раздел «Мои курсы»</w:t>
       </w:r>
     </w:p>
     <w:p>
@@ -123,7 +123,7 @@
           <w:b w:val="0"/>
           <w:sz w:val="22"/>
         </w:rPr>
-        <w:t>4. Страница курса</w:t>
+        <w:t>4. Как добавить курс</w:t>
       </w:r>
     </w:p>
     <w:p>
@@ -136,7 +136,7 @@
           <w:b w:val="0"/>
           <w:sz w:val="22"/>
         </w:rPr>
-        <w:t>5. Как добавить новую тему или тест в курс</w:t>
+        <w:t>5. Страница курса</w:t>
       </w:r>
     </w:p>
     <w:p>
@@ -149,7 +149,7 @@
           <w:b w:val="0"/>
           <w:sz w:val="22"/>
         </w:rPr>
-        <w:t>6. Как создать тест</w:t>
+        <w:t>6. Как добавить тему или тест в курс</w:t>
       </w:r>
     </w:p>
     <w:p>
@@ -162,7 +162,72 @@
           <w:b w:val="0"/>
           <w:sz w:val="22"/>
         </w:rPr>
-        <w:t>7. Как добавить учебные материалы</w:t>
+        <w:t>7. Работа с выбранной темой</w:t>
+      </w:r>
+    </w:p>
+    <w:p>
+      <w:pPr>
+        <w:pStyle w:val="ListBullet"/>
+      </w:pPr>
+      <w:r>
+        <w:rPr>
+          <w:rFonts w:ascii="Calibri" w:hAnsi="Calibri" w:eastAsia="Calibri"/>
+          <w:b w:val="0"/>
+          <w:sz w:val="22"/>
+        </w:rPr>
+        <w:t>8. Учебные материалы</w:t>
+      </w:r>
+    </w:p>
+    <w:p>
+      <w:pPr>
+        <w:pStyle w:val="ListBullet"/>
+      </w:pPr>
+      <w:r>
+        <w:rPr>
+          <w:rFonts w:ascii="Calibri" w:hAnsi="Calibri" w:eastAsia="Calibri"/>
+          <w:b w:val="0"/>
+          <w:sz w:val="22"/>
+        </w:rPr>
+        <w:t>9. Приглашение студентов</w:t>
+      </w:r>
+    </w:p>
+    <w:p>
+      <w:pPr>
+        <w:pStyle w:val="ListBullet"/>
+      </w:pPr>
+      <w:r>
+        <w:rPr>
+          <w:rFonts w:ascii="Calibri" w:hAnsi="Calibri" w:eastAsia="Calibri"/>
+          <w:b w:val="0"/>
+          <w:sz w:val="22"/>
+        </w:rPr>
+        <w:t>10. Успеваемость и управление курсом</w:t>
+      </w:r>
+    </w:p>
+    <w:p>
+      <w:pPr>
+        <w:pStyle w:val="ListBullet"/>
+      </w:pPr>
+      <w:r>
+        <w:rPr>
+          <w:rFonts w:ascii="Calibri" w:hAnsi="Calibri" w:eastAsia="Calibri"/>
+          <w:b w:val="0"/>
+          <w:sz w:val="22"/>
+        </w:rPr>
+        <w:t>11. Как создать тест</w:t>
+      </w:r>
+    </w:p>
+    <w:p>
+      <w:pPr>
+        <w:pStyle w:val="ListBullet"/>
+      </w:pPr>
+      <w:r>
+        <w:rPr>
+          <w:rFonts w:ascii="Calibri" w:hAnsi="Calibri" w:eastAsia="Calibri"/>
+          <w:b w:val="0"/>
+          <w:sz w:val="22"/>
+        </w:rPr>
+        <w:t>12. Коллекция вопросов</w:t>
       </w:r>
     </w:p>
     <w:p>
@@ -189,7 +254,7 @@
           <w:i w:val="0"/>
           <w:sz w:val="22"/>
         </w:rPr>
-        <w:t>Unet LMS использует те же учётные данные, что и корпоративная система UNET. Входите тем же логином (ПИН) и паролем, которые вы используете в UNET. Если у учётной записи несколько профилей, выберите тот же профиль, что и в UNET: для работы преподавателя это профиль «Сотрудник».</w:t>
+        <w:t>Unet LMS использует те же учётные данные, что и корпоративная система UNET. Входите логином (ПИН) и паролем UNET. Если у учётной записи несколько профилей, для работы преподавателя выберите «Сотрудник».</w:t>
       </w:r>
     </w:p>
     <w:p>
@@ -243,7 +308,7 @@
           <w:color w:val="5A5A5A"/>
           <w:sz w:val="18"/>
         </w:rPr>
-        <w:t>Рисунок 1. Экран входа Unet LMS</w:t>
+        <w:t>Рисунок 1. Экран входа: ПИН, пароль, вход через корпоративную почту</w:t>
       </w:r>
     </w:p>
     <w:p>
@@ -316,7 +381,7 @@
                 <w:b w:val="0"/>
                 <w:sz w:val="20"/>
               </w:rPr>
-              <w:t>Логин (ПИН)</w:t>
+              <w:t>ПИН</w:t>
             </w:r>
           </w:p>
         </w:tc>
@@ -332,7 +397,7 @@
                 <w:b w:val="0"/>
                 <w:sz w:val="20"/>
               </w:rPr>
-              <w:t>ПИН / логин из системы UNET</w:t>
+              <w:t>Логин из системы UNET</w:t>
             </w:r>
           </w:p>
         </w:tc>
@@ -383,7 +448,7 @@
           <w:b w:val="0"/>
           <w:sz w:val="22"/>
         </w:rPr>
-        <w:t>Откройте систему Unet LMS.</w:t>
+        <w:t>Откройте https://lms.kstu.kg.</w:t>
       </w:r>
     </w:p>
     <w:p>
@@ -396,7 +461,7 @@
           <w:b w:val="0"/>
           <w:sz w:val="22"/>
         </w:rPr>
-        <w:t>Введите логин (ПИН) и пароль от UNET.</w:t>
+        <w:t>Введите ПИН и пароль.</w:t>
       </w:r>
     </w:p>
     <w:p>
@@ -422,7 +487,7 @@
           <w:b w:val="0"/>
           <w:sz w:val="22"/>
         </w:rPr>
-        <w:t>Если появится экран «Выберите профиль для входа», выберите «Сотрудник» — тот же профиль, что в UNET. Не выбирайте «Студент».</w:t>
+        <w:t>Если появится выбор профиля, выберите «Сотрудник». Не выбирайте «Студент».</w:t>
       </w:r>
     </w:p>
     <w:p>
@@ -436,7 +501,7 @@
           <w:i/>
           <w:sz w:val="22"/>
         </w:rPr>
-        <w:t>Дополнительно доступен вход через Google. Для преподавателя основной способ — логин и пароль UNET. После успешного входа открывается раздел «Мои курсы».</w:t>
+        <w:t>Дополнительно доступен вход через «Корпоративная почта». После входа открывается страница «Сегодня». В шапке: Сегодня, Мои курсы, Тестирование, Коллекция вопросов, Нагрузка (если есть право), Руководство.</w:t>
       </w:r>
     </w:p>
     <w:p>
@@ -449,7 +514,7 @@
           <w:b/>
           <w:sz w:val="36"/>
         </w:rPr>
-        <w:t>2. Раздел «Мои курсы»</w:t>
+        <w:t>2. Страница «Сегодня»</w:t>
       </w:r>
     </w:p>
     <w:p>
@@ -463,7 +528,7 @@
           <w:i w:val="0"/>
           <w:sz w:val="22"/>
         </w:rPr>
-        <w:t>Это главная страница преподавателя. Вверху меню: «Мои курсы» и «Тестирование». Справа — поиск, уведомления и меню профиля.</w:t>
+        <w:t>Стартовый экран преподавателя. Слева очередь «На проверку» (сначала те, кто сдал раньше). Справа — фильтр по курсам, календарь сроков и объявления. Точка в календаре — день открытия задания.</w:t>
       </w:r>
     </w:p>
     <w:p>
@@ -482,7 +547,7 @@
               <a:graphicData uri="http://schemas.openxmlformats.org/drawingml/2006/picture">
                 <pic:pic>
                   <pic:nvPicPr>
-                    <pic:cNvPr id="0" name="04-my-courses.png"/>
+                    <pic:cNvPr id="0" name="02-today.png"/>
                     <pic:cNvPicPr/>
                   </pic:nvPicPr>
                   <pic:blipFill>
@@ -517,7 +582,20 @@
           <w:color w:val="5A5A5A"/>
           <w:sz w:val="18"/>
         </w:rPr>
-        <w:t>Рисунок 2. Список курсов преподавателя</w:t>
+        <w:t>Рисунок 2. «Сегодня»: очередь проверки, календарь и объявления</w:t>
+      </w:r>
+    </w:p>
+    <w:p>
+      <w:pPr>
+        <w:pStyle w:val="Heading1"/>
+      </w:pPr>
+      <w:r>
+        <w:rPr>
+          <w:rFonts w:ascii="Calibri" w:hAnsi="Calibri" w:eastAsia="Calibri"/>
+          <w:b/>
+          <w:sz w:val="36"/>
+        </w:rPr>
+        <w:t>3. Раздел «Мои курсы»</w:t>
       </w:r>
     </w:p>
     <w:p>
@@ -531,86 +609,61 @@
           <w:i w:val="0"/>
           <w:sz w:val="22"/>
         </w:rPr>
-        <w:t>На карточке курса отображаются:</w:t>
+        <w:t>Список дисциплин. Вкладки «Курсы» и «Архив». На карточке: студенты, проверено, средний балл, преподаватель, кнопки «Архив» и «Открыть». Пунктирная карточка создаёт новый курс.</w:t>
       </w:r>
     </w:p>
     <w:p>
       <w:pPr>
-        <w:pStyle w:val="ListBullet"/>
+        <w:jc w:val="center"/>
+      </w:pPr>
+      <w:r>
+        <w:drawing>
+          <wp:inline xmlns:a="http://schemas.openxmlformats.org/drawingml/2006/main" xmlns:pic="http://schemas.openxmlformats.org/drawingml/2006/picture">
+            <wp:extent cx="5688000" cy="3555000"/>
+            <wp:docPr id="3" name="Picture 3"/>
+            <wp:cNvGraphicFramePr>
+              <a:graphicFrameLocks noChangeAspect="1"/>
+            </wp:cNvGraphicFramePr>
+            <a:graphic>
+              <a:graphicData uri="http://schemas.openxmlformats.org/drawingml/2006/picture">
+                <pic:pic>
+                  <pic:nvPicPr>
+                    <pic:cNvPr id="0" name="03-my-courses.png"/>
+                    <pic:cNvPicPr/>
+                  </pic:nvPicPr>
+                  <pic:blipFill>
+                    <a:blip r:embed="rId11"/>
+                    <a:stretch>
+                      <a:fillRect/>
+                    </a:stretch>
+                  </pic:blipFill>
+                  <pic:spPr>
+                    <a:xfrm>
+                      <a:off x="0" y="0"/>
+                      <a:ext cx="5688000" cy="3555000"/>
+                    </a:xfrm>
+                    <a:prstGeom prst="rect"/>
+                  </pic:spPr>
+                </pic:pic>
+              </a:graphicData>
+            </a:graphic>
+          </wp:inline>
+        </w:drawing>
+      </w:r>
+    </w:p>
+    <w:p>
+      <w:pPr>
+        <w:spacing w:after="240"/>
+        <w:jc w:val="center"/>
       </w:pPr>
       <w:r>
         <w:rPr>
           <w:rFonts w:ascii="Calibri" w:hAnsi="Calibri" w:eastAsia="Calibri"/>
           <w:b w:val="0"/>
-          <w:sz w:val="22"/>
+          <w:color w:val="5A5A5A"/>
+          <w:sz w:val="18"/>
         </w:rPr>
-        <w:t>название дисциплины;</w:t>
-      </w:r>
-    </w:p>
-    <w:p>
-      <w:pPr>
-        <w:pStyle w:val="ListBullet"/>
-      </w:pPr>
-      <w:r>
-        <w:rPr>
-          <w:rFonts w:ascii="Calibri" w:hAnsi="Calibri" w:eastAsia="Calibri"/>
-          <w:b w:val="0"/>
-          <w:sz w:val="22"/>
-        </w:rPr>
-        <w:t>количество кредитов;</w:t>
-      </w:r>
-    </w:p>
-    <w:p>
-      <w:pPr>
-        <w:pStyle w:val="ListBullet"/>
-      </w:pPr>
-      <w:r>
-        <w:rPr>
-          <w:rFonts w:ascii="Calibri" w:hAnsi="Calibri" w:eastAsia="Calibri"/>
-          <w:b w:val="0"/>
-          <w:sz w:val="22"/>
-        </w:rPr>
-        <w:t>форма контроля;</w:t>
-      </w:r>
-    </w:p>
-    <w:p>
-      <w:pPr>
-        <w:pStyle w:val="ListBullet"/>
-      </w:pPr>
-      <w:r>
-        <w:rPr>
-          <w:rFonts w:ascii="Calibri" w:hAnsi="Calibri" w:eastAsia="Calibri"/>
-          <w:b w:val="0"/>
-          <w:sz w:val="22"/>
-        </w:rPr>
-        <w:t>ФИО преподавателя;</w:t>
-      </w:r>
-    </w:p>
-    <w:p>
-      <w:pPr>
-        <w:pStyle w:val="ListBullet"/>
-      </w:pPr>
-      <w:r>
-        <w:rPr>
-          <w:rFonts w:ascii="Calibri" w:hAnsi="Calibri" w:eastAsia="Calibri"/>
-          <w:b w:val="0"/>
-          <w:sz w:val="22"/>
-        </w:rPr>
-        <w:t>кнопка «Подробнее» — открывает учебный процесс курса.</w:t>
-      </w:r>
-    </w:p>
-    <w:p>
-      <w:pPr>
-        <w:spacing w:after="160" w:before="0"/>
-      </w:pPr>
-      <w:r>
-        <w:rPr>
-          <w:rFonts w:ascii="Calibri" w:hAnsi="Calibri" w:eastAsia="Calibri"/>
-          <w:b w:val="0"/>
-          <w:i w:val="0"/>
-          <w:sz w:val="22"/>
-        </w:rPr>
-        <w:t>Рядом есть пунктирная карточка «Добавить курс». Через неё создаётся новая дисциплина.</w:t>
+        <w:t>Рисунок 3. Карточки курсов и «Добавить курс»</w:t>
       </w:r>
     </w:p>
     <w:p>
@@ -623,7 +676,7 @@
           <w:b/>
           <w:sz w:val="36"/>
         </w:rPr>
-        <w:t>3. Как добавить курс</w:t>
+        <w:t>4. Как добавить курс</w:t>
       </w:r>
     </w:p>
     <w:p>
@@ -662,20 +715,7 @@
           <w:b w:val="0"/>
           <w:sz w:val="22"/>
         </w:rPr>
-        <w:t>Справа откроется панель «Создание курса».</w:t>
-      </w:r>
-    </w:p>
-    <w:p>
-      <w:pPr>
-        <w:pStyle w:val="ListNumber"/>
-      </w:pPr>
-      <w:r>
-        <w:rPr>
-          <w:rFonts w:ascii="Calibri" w:hAnsi="Calibri" w:eastAsia="Calibri"/>
-          <w:b w:val="0"/>
-          <w:sz w:val="22"/>
-        </w:rPr>
-        <w:t>Заполните форму и нажмите «Добавить курс».</w:t>
+        <w:t>Заполните форму справа и нажмите «Добавить курс».</w:t>
       </w:r>
     </w:p>
     <w:p>
@@ -686,7 +726,7 @@
         <w:drawing>
           <wp:inline xmlns:a="http://schemas.openxmlformats.org/drawingml/2006/main" xmlns:pic="http://schemas.openxmlformats.org/drawingml/2006/picture">
             <wp:extent cx="5688000" cy="3555000"/>
-            <wp:docPr id="3" name="Picture 3"/>
+            <wp:docPr id="4" name="Picture 4"/>
             <wp:cNvGraphicFramePr>
               <a:graphicFrameLocks noChangeAspect="1"/>
             </wp:cNvGraphicFramePr>
@@ -694,11 +734,11 @@
               <a:graphicData uri="http://schemas.openxmlformats.org/drawingml/2006/picture">
                 <pic:pic>
                   <pic:nvPicPr>
-                    <pic:cNvPr id="0" name="05-add-course-form.png"/>
+                    <pic:cNvPr id="0" name="04-add-course.png"/>
                     <pic:cNvPicPr/>
                   </pic:nvPicPr>
                   <pic:blipFill>
-                    <a:blip r:embed="rId11"/>
+                    <a:blip r:embed="rId12"/>
                     <a:stretch>
                       <a:fillRect/>
                     </a:stretch>
@@ -729,20 +769,7 @@
           <w:color w:val="5A5A5A"/>
           <w:sz w:val="18"/>
         </w:rPr>
-        <w:t>Рисунок 3. Панель «Создание курса»</w:t>
-      </w:r>
-    </w:p>
-    <w:p>
-      <w:pPr>
-        <w:pStyle w:val="Heading2"/>
-      </w:pPr>
-      <w:r>
-        <w:rPr>
-          <w:rFonts w:ascii="Calibri" w:hAnsi="Calibri" w:eastAsia="Calibri"/>
-          <w:b/>
-          <w:sz w:val="28"/>
-        </w:rPr>
-        <w:t>Поля формы «Создание курса»</w:t>
+        <w:t>Рисунок 4. Панель создания курса: название и кафедра</w:t>
       </w:r>
     </w:p>
     <w:tbl>
@@ -819,7 +846,7 @@
                 <w:b w:val="0"/>
                 <w:sz w:val="20"/>
               </w:rPr>
-              <w:t>Дисциплина</w:t>
+              <w:t>Название курса</w:t>
             </w:r>
           </w:p>
         </w:tc>
@@ -851,7 +878,7 @@
                 <w:b w:val="0"/>
                 <w:sz w:val="20"/>
               </w:rPr>
-              <w:t>Название курса, от 6 до 30 символов. Пример: «Программирование».</w:t>
+              <w:t>До 100 символов.</w:t>
             </w:r>
           </w:p>
         </w:tc>
@@ -869,7 +896,7 @@
                 <w:b w:val="0"/>
                 <w:sz w:val="20"/>
               </w:rPr>
-              <w:t>Кредит</w:t>
+              <w:t>Кафедра</w:t>
             </w:r>
           </w:p>
         </w:tc>
@@ -901,57 +928,7 @@
                 <w:b w:val="0"/>
                 <w:sz w:val="20"/>
               </w:rPr>
-              <w:t>Количество кредитов: 3, 4, 5 или 6.</w:t>
-            </w:r>
-          </w:p>
-        </w:tc>
-      </w:tr>
-      <w:tr>
-        <w:tc>
-          <w:tcPr>
-            <w:tcW w:type="dxa" w:w="3324"/>
-          </w:tcPr>
-          <w:p>
-            <w:r/>
-            <w:r>
-              <w:rPr>
-                <w:rFonts w:ascii="Calibri" w:hAnsi="Calibri" w:eastAsia="Calibri"/>
-                <w:b w:val="0"/>
-                <w:sz w:val="20"/>
-              </w:rPr>
-              <w:t>Форма контроля</w:t>
-            </w:r>
-          </w:p>
-        </w:tc>
-        <w:tc>
-          <w:tcPr>
-            <w:tcW w:type="dxa" w:w="3324"/>
-          </w:tcPr>
-          <w:p>
-            <w:r/>
-            <w:r>
-              <w:rPr>
-                <w:rFonts w:ascii="Calibri" w:hAnsi="Calibri" w:eastAsia="Calibri"/>
-                <w:b w:val="0"/>
-                <w:sz w:val="20"/>
-              </w:rPr>
-              <w:t>Да</w:t>
-            </w:r>
-          </w:p>
-        </w:tc>
-        <w:tc>
-          <w:tcPr>
-            <w:tcW w:type="dxa" w:w="3324"/>
-          </w:tcPr>
-          <w:p>
-            <w:r/>
-            <w:r>
-              <w:rPr>
-                <w:rFonts w:ascii="Calibri" w:hAnsi="Calibri" w:eastAsia="Calibri"/>
-                <w:b w:val="0"/>
-                <w:sz w:val="20"/>
-              </w:rPr>
-              <w:t>Итоговая форма: Экзамен, Устный, СРС, Отчет или Тестирование.</w:t>
+              <w:t>Организация из профиля сотрудника.</w:t>
             </w:r>
           </w:p>
         </w:tc>
@@ -960,56 +937,121 @@
     <w:p/>
     <w:p>
       <w:pPr>
-        <w:jc w:val="center"/>
-      </w:pPr>
-      <w:r>
-        <w:drawing>
-          <wp:inline xmlns:a="http://schemas.openxmlformats.org/drawingml/2006/main" xmlns:pic="http://schemas.openxmlformats.org/drawingml/2006/picture">
-            <wp:extent cx="5688000" cy="3555000"/>
-            <wp:docPr id="4" name="Picture 4"/>
-            <wp:cNvGraphicFramePr>
-              <a:graphicFrameLocks noChangeAspect="1"/>
-            </wp:cNvGraphicFramePr>
-            <a:graphic>
-              <a:graphicData uri="http://schemas.openxmlformats.org/drawingml/2006/picture">
-                <pic:pic>
-                  <pic:nvPicPr>
-                    <pic:cNvPr id="0" name="06-add-course-credits.png"/>
-                    <pic:cNvPicPr/>
-                  </pic:nvPicPr>
-                  <pic:blipFill>
-                    <a:blip r:embed="rId12"/>
-                    <a:stretch>
-                      <a:fillRect/>
-                    </a:stretch>
-                  </pic:blipFill>
-                  <pic:spPr>
-                    <a:xfrm>
-                      <a:off x="0" y="0"/>
-                      <a:ext cx="5688000" cy="3555000"/>
-                    </a:xfrm>
-                    <a:prstGeom prst="rect"/>
-                  </pic:spPr>
-                </pic:pic>
-              </a:graphicData>
-            </a:graphic>
-          </wp:inline>
-        </w:drawing>
-      </w:r>
-    </w:p>
-    <w:p>
-      <w:pPr>
-        <w:spacing w:after="240"/>
-        <w:jc w:val="center"/>
+        <w:spacing w:after="160" w:before="0"/>
       </w:pPr>
       <w:r>
         <w:rPr>
           <w:rFonts w:ascii="Calibri" w:hAnsi="Calibri" w:eastAsia="Calibri"/>
           <w:b w:val="0"/>
-          <w:color w:val="5A5A5A"/>
-          <w:sz w:val="18"/>
+          <w:i/>
+          <w:sz w:val="22"/>
         </w:rPr>
-        <w:t>Рисунок 4. Выбор кредитов: 3, 4, 5 или 6</w:t>
+        <w:t>Кредиты и форма контроля при создании курса больше не заполняются. Название и кафедру можно изменить во вкладке «Управление курсом».</w:t>
+      </w:r>
+    </w:p>
+    <w:p>
+      <w:pPr>
+        <w:pStyle w:val="Heading1"/>
+      </w:pPr>
+      <w:r>
+        <w:rPr>
+          <w:rFonts w:ascii="Calibri" w:hAnsi="Calibri" w:eastAsia="Calibri"/>
+          <w:b/>
+          <w:sz w:val="36"/>
+        </w:rPr>
+        <w:t>5. Страница курса</w:t>
+      </w:r>
+    </w:p>
+    <w:p>
+      <w:pPr>
+        <w:spacing w:after="160" w:before="0"/>
+      </w:pPr>
+      <w:r>
+        <w:rPr>
+          <w:rFonts w:ascii="Calibri" w:hAnsi="Calibri" w:eastAsia="Calibri"/>
+          <w:b w:val="0"/>
+          <w:i w:val="0"/>
+          <w:sz w:val="22"/>
+        </w:rPr>
+        <w:t>Нажмите «Открыть». Рядом с названием — QR для приглашения. Вкладки:</w:t>
+      </w:r>
+    </w:p>
+    <w:p>
+      <w:pPr>
+        <w:pStyle w:val="ListBullet"/>
+      </w:pPr>
+      <w:r>
+        <w:rPr>
+          <w:rFonts w:ascii="Calibri" w:hAnsi="Calibri" w:eastAsia="Calibri"/>
+          <w:b w:val="0"/>
+          <w:sz w:val="22"/>
+        </w:rPr>
+        <w:t>Учебный процесс — темы и тесты по типу занятия;</w:t>
+      </w:r>
+    </w:p>
+    <w:p>
+      <w:pPr>
+        <w:pStyle w:val="ListBullet"/>
+      </w:pPr>
+      <w:r>
+        <w:rPr>
+          <w:rFonts w:ascii="Calibri" w:hAnsi="Calibri" w:eastAsia="Calibri"/>
+          <w:b w:val="0"/>
+          <w:sz w:val="22"/>
+        </w:rPr>
+        <w:t>Лента курса — объявления и журнал загрузок;</w:t>
+      </w:r>
+    </w:p>
+    <w:p>
+      <w:pPr>
+        <w:pStyle w:val="ListBullet"/>
+      </w:pPr>
+      <w:r>
+        <w:rPr>
+          <w:rFonts w:ascii="Calibri" w:hAnsi="Calibri" w:eastAsia="Calibri"/>
+          <w:b w:val="0"/>
+          <w:sz w:val="22"/>
+        </w:rPr>
+        <w:t>Материалы — все файлы курса;</w:t>
+      </w:r>
+    </w:p>
+    <w:p>
+      <w:pPr>
+        <w:pStyle w:val="ListBullet"/>
+      </w:pPr>
+      <w:r>
+        <w:rPr>
+          <w:rFonts w:ascii="Calibri" w:hAnsi="Calibri" w:eastAsia="Calibri"/>
+          <w:b w:val="0"/>
+          <w:sz w:val="22"/>
+        </w:rPr>
+        <w:t>О курсе — описание;</w:t>
+      </w:r>
+    </w:p>
+    <w:p>
+      <w:pPr>
+        <w:pStyle w:val="ListBullet"/>
+      </w:pPr>
+      <w:r>
+        <w:rPr>
+          <w:rFonts w:ascii="Calibri" w:hAnsi="Calibri" w:eastAsia="Calibri"/>
+          <w:b w:val="0"/>
+          <w:sz w:val="22"/>
+        </w:rPr>
+        <w:t>Успеваемость студентов — баллы и Excel;</w:t>
+      </w:r>
+    </w:p>
+    <w:p>
+      <w:pPr>
+        <w:pStyle w:val="ListBullet"/>
+      </w:pPr>
+      <w:r>
+        <w:rPr>
+          <w:rFonts w:ascii="Calibri" w:hAnsi="Calibri" w:eastAsia="Calibri"/>
+          <w:b w:val="0"/>
+          <w:sz w:val="22"/>
+        </w:rPr>
+        <w:t>Управление курсом — настройки, доступ, потоки, дублирование, удаление.</w:t>
       </w:r>
     </w:p>
     <w:p>
@@ -1028,7 +1070,7 @@
               <a:graphicData uri="http://schemas.openxmlformats.org/drawingml/2006/picture">
                 <pic:pic>
                   <pic:nvPicPr>
-                    <pic:cNvPr id="0" name="07-add-course-control.png"/>
+                    <pic:cNvPr id="0" name="05-course-study.png"/>
                     <pic:cNvPicPr/>
                   </pic:nvPicPr>
                   <pic:blipFill>
@@ -1063,100 +1105,7 @@
           <w:color w:val="5A5A5A"/>
           <w:sz w:val="18"/>
         </w:rPr>
-        <w:t>Рисунок 5. Форма контроля: Экзамен, Устный, СРС, Отчет, Тестирование</w:t>
-      </w:r>
-    </w:p>
-    <w:p>
-      <w:pPr>
-        <w:spacing w:after="160" w:before="0"/>
-      </w:pPr>
-      <w:r>
-        <w:rPr>
-          <w:rFonts w:ascii="Calibri" w:hAnsi="Calibri" w:eastAsia="Calibri"/>
-          <w:b w:val="0"/>
-          <w:i/>
-          <w:sz w:val="22"/>
-        </w:rPr>
-        <w:t>После сохранения курс появляется в списке. Чтобы перейти к темам, тестам и материалам, нажмите «Подробнее».</w:t>
-      </w:r>
-    </w:p>
-    <w:p>
-      <w:pPr>
-        <w:pStyle w:val="Heading1"/>
-      </w:pPr>
-      <w:r>
-        <w:rPr>
-          <w:rFonts w:ascii="Calibri" w:hAnsi="Calibri" w:eastAsia="Calibri"/>
-          <w:b/>
-          <w:sz w:val="36"/>
-        </w:rPr>
-        <w:t>4. Страница курса</w:t>
-      </w:r>
-    </w:p>
-    <w:p>
-      <w:pPr>
-        <w:spacing w:after="160" w:before="0"/>
-      </w:pPr>
-      <w:r>
-        <w:rPr>
-          <w:rFonts w:ascii="Calibri" w:hAnsi="Calibri" w:eastAsia="Calibri"/>
-          <w:b w:val="0"/>
-          <w:i w:val="0"/>
-          <w:sz w:val="22"/>
-        </w:rPr>
-        <w:t>Для преподавателя доступны вкладки:</w:t>
-      </w:r>
-    </w:p>
-    <w:p>
-      <w:pPr>
-        <w:pStyle w:val="ListBullet"/>
-      </w:pPr>
-      <w:r>
-        <w:rPr>
-          <w:rFonts w:ascii="Calibri" w:hAnsi="Calibri" w:eastAsia="Calibri"/>
-          <w:b w:val="0"/>
-          <w:sz w:val="22"/>
-        </w:rPr>
-        <w:t>Учебный процесс — темы, тесты и материалы;</w:t>
-      </w:r>
-    </w:p>
-    <w:p>
-      <w:pPr>
-        <w:pStyle w:val="ListBullet"/>
-      </w:pPr>
-      <w:r>
-        <w:rPr>
-          <w:rFonts w:ascii="Calibri" w:hAnsi="Calibri" w:eastAsia="Calibri"/>
-          <w:b w:val="0"/>
-          <w:sz w:val="22"/>
-        </w:rPr>
-        <w:t>О курсе — описание дисциплины;</w:t>
-      </w:r>
-    </w:p>
-    <w:p>
-      <w:pPr>
-        <w:pStyle w:val="ListBullet"/>
-      </w:pPr>
-      <w:r>
-        <w:rPr>
-          <w:rFonts w:ascii="Calibri" w:hAnsi="Calibri" w:eastAsia="Calibri"/>
-          <w:b w:val="0"/>
-          <w:sz w:val="22"/>
-        </w:rPr>
-        <w:t>Успеваемость студентов — результаты обучающихся;</w:t>
-      </w:r>
-    </w:p>
-    <w:p>
-      <w:pPr>
-        <w:pStyle w:val="ListBullet"/>
-      </w:pPr>
-      <w:r>
-        <w:rPr>
-          <w:rFonts w:ascii="Calibri" w:hAnsi="Calibri" w:eastAsia="Calibri"/>
-          <w:b w:val="0"/>
-          <w:sz w:val="22"/>
-        </w:rPr>
-        <w:t>Управление курсом — настройки курса.</w:t>
+        <w:t>Рисунок 5. Учебный процесс</w:t>
       </w:r>
     </w:p>
     <w:p>
@@ -1175,7 +1124,7 @@
               <a:graphicData uri="http://schemas.openxmlformats.org/drawingml/2006/picture">
                 <pic:pic>
                   <pic:nvPicPr>
-                    <pic:cNvPr id="0" name="08-course-details.png"/>
+                    <pic:cNvPr id="0" name="10-course-feed.png"/>
                     <pic:cNvPicPr/>
                   </pic:nvPicPr>
                   <pic:blipFill>
@@ -1210,35 +1159,7 @@
           <w:color w:val="5A5A5A"/>
           <w:sz w:val="18"/>
         </w:rPr>
-        <w:t>Рисунок 6. Вкладка «Учебный процесс»</w:t>
-      </w:r>
-    </w:p>
-    <w:p>
-      <w:pPr>
-        <w:spacing w:after="160" w:before="0"/>
-      </w:pPr>
-      <w:r>
-        <w:rPr>
-          <w:rFonts w:ascii="Calibri" w:hAnsi="Calibri" w:eastAsia="Calibri"/>
-          <w:b w:val="0"/>
-          <w:i w:val="0"/>
-          <w:sz w:val="22"/>
-        </w:rPr>
-        <w:t>Слева — список заданий. У темы видны название, неделя, статус «Открыт» или закрыто, баллы и меню действий.</w:t>
-      </w:r>
-    </w:p>
-    <w:p>
-      <w:pPr>
-        <w:spacing w:after="160" w:before="0"/>
-      </w:pPr>
-      <w:r>
-        <w:rPr>
-          <w:rFonts w:ascii="Calibri" w:hAnsi="Calibri" w:eastAsia="Calibri"/>
-          <w:b w:val="0"/>
-          <w:i w:val="0"/>
-          <w:sz w:val="22"/>
-        </w:rPr>
-        <w:t>Справа, пока тема не выбрана, показаны подсказки. Под списком тем — блок «Добавить новую тему или тест» с кнопкой «Добавить».</w:t>
+        <w:t>Рисунок 6. Лента курса</w:t>
       </w:r>
     </w:p>
     <w:p>
@@ -1251,7 +1172,7 @@
           <w:b/>
           <w:sz w:val="36"/>
         </w:rPr>
-        <w:t>5. Как добавить новую тему или тест в курс</w:t>
+        <w:t>6. Как добавить тему или тест в курс</w:t>
       </w:r>
     </w:p>
     <w:p>
@@ -1264,7 +1185,7 @@
           <w:b w:val="0"/>
           <w:sz w:val="22"/>
         </w:rPr>
-        <w:t>Откройте курс через «Подробнее».</w:t>
+        <w:t>Откройте курс, вкладка «Учебный процесс».</w:t>
       </w:r>
     </w:p>
     <w:p>
@@ -1277,7 +1198,7 @@
           <w:b w:val="0"/>
           <w:sz w:val="22"/>
         </w:rPr>
-        <w:t>Оставайтесь на вкладке «Учебный процесс».</w:t>
+        <w:t>Нажмите «Добавить».</w:t>
       </w:r>
     </w:p>
     <w:p>
@@ -1290,20 +1211,7 @@
           <w:b w:val="0"/>
           <w:sz w:val="22"/>
         </w:rPr>
-        <w:t>Нажмите «Добавить» в блоке «Добавить новую тему или тест».</w:t>
-      </w:r>
-    </w:p>
-    <w:p>
-      <w:pPr>
-        <w:pStyle w:val="ListNumber"/>
-      </w:pPr>
-      <w:r>
-        <w:rPr>
-          <w:rFonts w:ascii="Calibri" w:hAnsi="Calibri" w:eastAsia="Calibri"/>
-          <w:b w:val="0"/>
-          <w:sz w:val="22"/>
-        </w:rPr>
-        <w:t>Справа откроется панель «Создание темы».</w:t>
+        <w:t>Выберите тип занятия и заполните поля.</w:t>
       </w:r>
     </w:p>
     <w:p>
@@ -1322,7 +1230,7 @@
               <a:graphicData uri="http://schemas.openxmlformats.org/drawingml/2006/picture">
                 <pic:pic>
                   <pic:nvPicPr>
-                    <pic:cNvPr id="0" name="09-add-theme-form.png"/>
+                    <pic:cNvPr id="0" name="06-add-theme.png"/>
                     <pic:cNvPicPr/>
                   </pic:nvPicPr>
                   <pic:blipFill>
@@ -1362,20 +1270,6 @@
     </w:p>
     <w:p>
       <w:pPr>
-        <w:spacing w:after="160" w:before="0"/>
-      </w:pPr>
-      <w:r>
-        <w:rPr>
-          <w:rFonts w:ascii="Calibri" w:hAnsi="Calibri" w:eastAsia="Calibri"/>
-          <w:b w:val="0"/>
-          <w:i w:val="0"/>
-          <w:sz w:val="22"/>
-        </w:rPr>
-        <w:t>Сначала выберите тип занятия: лабораторная работа, практическое занятие, лекционное занятие, другое, СРС или тест.</w:t>
-      </w:r>
-    </w:p>
-    <w:p>
-      <w:pPr>
         <w:jc w:val="center"/>
       </w:pPr>
       <w:r>
@@ -1390,7 +1284,7 @@
               <a:graphicData uri="http://schemas.openxmlformats.org/drawingml/2006/picture">
                 <pic:pic>
                   <pic:nvPicPr>
-                    <pic:cNvPr id="0" name="10-add-theme-types.png"/>
+                    <pic:cNvPr id="0" name="07-add-theme-types.png"/>
                     <pic:cNvPicPr/>
                   </pic:nvPicPr>
                   <pic:blipFill>
@@ -1425,7 +1319,7 @@
           <w:color w:val="5A5A5A"/>
           <w:sz w:val="18"/>
         </w:rPr>
-        <w:t>Рисунок 8. Список типов занятия</w:t>
+        <w:t>Рисунок 8. Типы занятия</w:t>
       </w:r>
     </w:p>
     <w:p>
@@ -1438,372 +1332,23 @@
           <w:b/>
           <w:sz w:val="28"/>
         </w:rPr>
-        <w:t>Обычная тема (лекция, практика, лабораторная, СРС, другое)</w:t>
+        <w:t>Оцениваемые типы</w:t>
       </w:r>
     </w:p>
-    <w:tbl>
-      <w:tblPr>
-        <w:tblStyle w:val="TableGrid"/>
-        <w:tblW w:type="auto" w:w="0"/>
-        <w:tblLook w:firstColumn="1" w:firstRow="1" w:lastColumn="0" w:lastRow="0" w:noHBand="0" w:noVBand="1" w:val="04A0"/>
-      </w:tblPr>
-      <w:tblGrid>
-        <w:gridCol w:w="3324"/>
-        <w:gridCol w:w="3324"/>
-        <w:gridCol w:w="3324"/>
-      </w:tblGrid>
-      <w:tr>
-        <w:tc>
-          <w:tcPr>
-            <w:tcW w:type="dxa" w:w="3324"/>
-          </w:tcPr>
-          <w:p>
-            <w:r/>
-            <w:r>
-              <w:rPr>
-                <w:rFonts w:ascii="Calibri" w:hAnsi="Calibri" w:eastAsia="Calibri"/>
-                <w:b/>
-                <w:sz w:val="20"/>
-              </w:rPr>
-              <w:t>Поле</w:t>
-            </w:r>
-          </w:p>
-        </w:tc>
-        <w:tc>
-          <w:tcPr>
-            <w:tcW w:type="dxa" w:w="3324"/>
-          </w:tcPr>
-          <w:p>
-            <w:r/>
-            <w:r>
-              <w:rPr>
-                <w:rFonts w:ascii="Calibri" w:hAnsi="Calibri" w:eastAsia="Calibri"/>
-                <w:b/>
-                <w:sz w:val="20"/>
-              </w:rPr>
-              <w:t>Обязательно</w:t>
-            </w:r>
-          </w:p>
-        </w:tc>
-        <w:tc>
-          <w:tcPr>
-            <w:tcW w:type="dxa" w:w="3324"/>
-          </w:tcPr>
-          <w:p>
-            <w:r/>
-            <w:r>
-              <w:rPr>
-                <w:rFonts w:ascii="Calibri" w:hAnsi="Calibri" w:eastAsia="Calibri"/>
-                <w:b/>
-                <w:sz w:val="20"/>
-              </w:rPr>
-              <w:t>Описание</w:t>
-            </w:r>
-          </w:p>
-        </w:tc>
-      </w:tr>
-      <w:tr>
-        <w:tc>
-          <w:tcPr>
-            <w:tcW w:type="dxa" w:w="3324"/>
-          </w:tcPr>
-          <w:p>
-            <w:r/>
-            <w:r>
-              <w:rPr>
-                <w:rFonts w:ascii="Calibri" w:hAnsi="Calibri" w:eastAsia="Calibri"/>
-                <w:b w:val="0"/>
-                <w:sz w:val="20"/>
-              </w:rPr>
-              <w:t>Тип занятия</w:t>
-            </w:r>
-          </w:p>
-        </w:tc>
-        <w:tc>
-          <w:tcPr>
-            <w:tcW w:type="dxa" w:w="3324"/>
-          </w:tcPr>
-          <w:p>
-            <w:r/>
-            <w:r>
-              <w:rPr>
-                <w:rFonts w:ascii="Calibri" w:hAnsi="Calibri" w:eastAsia="Calibri"/>
-                <w:b w:val="0"/>
-                <w:sz w:val="20"/>
-              </w:rPr>
-              <w:t>Да</w:t>
-            </w:r>
-          </w:p>
-        </w:tc>
-        <w:tc>
-          <w:tcPr>
-            <w:tcW w:type="dxa" w:w="3324"/>
-          </w:tcPr>
-          <w:p>
-            <w:r/>
-            <w:r>
-              <w:rPr>
-                <w:rFonts w:ascii="Calibri" w:hAnsi="Calibri" w:eastAsia="Calibri"/>
-                <w:b w:val="0"/>
-                <w:sz w:val="20"/>
-              </w:rPr>
-              <w:t>Вид работы в учебном плане.</w:t>
-            </w:r>
-          </w:p>
-        </w:tc>
-      </w:tr>
-      <w:tr>
-        <w:tc>
-          <w:tcPr>
-            <w:tcW w:type="dxa" w:w="3324"/>
-          </w:tcPr>
-          <w:p>
-            <w:r/>
-            <w:r>
-              <w:rPr>
-                <w:rFonts w:ascii="Calibri" w:hAnsi="Calibri" w:eastAsia="Calibri"/>
-                <w:b w:val="0"/>
-                <w:sz w:val="20"/>
-              </w:rPr>
-              <w:t>Неделя</w:t>
-            </w:r>
-          </w:p>
-        </w:tc>
-        <w:tc>
-          <w:tcPr>
-            <w:tcW w:type="dxa" w:w="3324"/>
-          </w:tcPr>
-          <w:p>
-            <w:r/>
-            <w:r>
-              <w:rPr>
-                <w:rFonts w:ascii="Calibri" w:hAnsi="Calibri" w:eastAsia="Calibri"/>
-                <w:b w:val="0"/>
-                <w:sz w:val="20"/>
-              </w:rPr>
-              <w:t>Да</w:t>
-            </w:r>
-          </w:p>
-        </w:tc>
-        <w:tc>
-          <w:tcPr>
-            <w:tcW w:type="dxa" w:w="3324"/>
-          </w:tcPr>
-          <w:p>
-            <w:r/>
-            <w:r>
-              <w:rPr>
-                <w:rFonts w:ascii="Calibri" w:hAnsi="Calibri" w:eastAsia="Calibri"/>
-                <w:b w:val="0"/>
-                <w:sz w:val="20"/>
-              </w:rPr>
-              <w:t>Неделя с 1 по 16. По умолчанию — неделя 1.</w:t>
-            </w:r>
-          </w:p>
-        </w:tc>
-      </w:tr>
-      <w:tr>
-        <w:tc>
-          <w:tcPr>
-            <w:tcW w:type="dxa" w:w="3324"/>
-          </w:tcPr>
-          <w:p>
-            <w:r/>
-            <w:r>
-              <w:rPr>
-                <w:rFonts w:ascii="Calibri" w:hAnsi="Calibri" w:eastAsia="Calibri"/>
-                <w:b w:val="0"/>
-                <w:sz w:val="20"/>
-              </w:rPr>
-              <w:t>Название</w:t>
-            </w:r>
-          </w:p>
-        </w:tc>
-        <w:tc>
-          <w:tcPr>
-            <w:tcW w:type="dxa" w:w="3324"/>
-          </w:tcPr>
-          <w:p>
-            <w:r/>
-            <w:r>
-              <w:rPr>
-                <w:rFonts w:ascii="Calibri" w:hAnsi="Calibri" w:eastAsia="Calibri"/>
-                <w:b w:val="0"/>
-                <w:sz w:val="20"/>
-              </w:rPr>
-              <w:t>Да</w:t>
-            </w:r>
-          </w:p>
-        </w:tc>
-        <w:tc>
-          <w:tcPr>
-            <w:tcW w:type="dxa" w:w="3324"/>
-          </w:tcPr>
-          <w:p>
-            <w:r/>
-            <w:r>
-              <w:rPr>
-                <w:rFonts w:ascii="Calibri" w:hAnsi="Calibri" w:eastAsia="Calibri"/>
-                <w:b w:val="0"/>
-                <w:sz w:val="20"/>
-              </w:rPr>
-              <w:t>Название темы или задания.</w:t>
-            </w:r>
-          </w:p>
-        </w:tc>
-      </w:tr>
-      <w:tr>
-        <w:tc>
-          <w:tcPr>
-            <w:tcW w:type="dxa" w:w="3324"/>
-          </w:tcPr>
-          <w:p>
-            <w:r/>
-            <w:r>
-              <w:rPr>
-                <w:rFonts w:ascii="Calibri" w:hAnsi="Calibri" w:eastAsia="Calibri"/>
-                <w:b w:val="0"/>
-                <w:sz w:val="20"/>
-              </w:rPr>
-              <w:t>Описание</w:t>
-            </w:r>
-          </w:p>
-        </w:tc>
-        <w:tc>
-          <w:tcPr>
-            <w:tcW w:type="dxa" w:w="3324"/>
-          </w:tcPr>
-          <w:p>
-            <w:r/>
-            <w:r>
-              <w:rPr>
-                <w:rFonts w:ascii="Calibri" w:hAnsi="Calibri" w:eastAsia="Calibri"/>
-                <w:b w:val="0"/>
-                <w:sz w:val="20"/>
-              </w:rPr>
-              <w:t>Да</w:t>
-            </w:r>
-          </w:p>
-        </w:tc>
-        <w:tc>
-          <w:tcPr>
-            <w:tcW w:type="dxa" w:w="3324"/>
-          </w:tcPr>
-          <w:p>
-            <w:r/>
-            <w:r>
-              <w:rPr>
-                <w:rFonts w:ascii="Calibri" w:hAnsi="Calibri" w:eastAsia="Calibri"/>
-                <w:b w:val="0"/>
-                <w:sz w:val="20"/>
-              </w:rPr>
-              <w:t>Что должен сделать студент.</w:t>
-            </w:r>
-          </w:p>
-        </w:tc>
-      </w:tr>
-      <w:tr>
-        <w:tc>
-          <w:tcPr>
-            <w:tcW w:type="dxa" w:w="3324"/>
-          </w:tcPr>
-          <w:p>
-            <w:r/>
-            <w:r>
-              <w:rPr>
-                <w:rFonts w:ascii="Calibri" w:hAnsi="Calibri" w:eastAsia="Calibri"/>
-                <w:b w:val="0"/>
-                <w:sz w:val="20"/>
-              </w:rPr>
-              <w:t>Макс. баллы</w:t>
-            </w:r>
-          </w:p>
-        </w:tc>
-        <w:tc>
-          <w:tcPr>
-            <w:tcW w:type="dxa" w:w="3324"/>
-          </w:tcPr>
-          <w:p>
-            <w:r/>
-            <w:r>
-              <w:rPr>
-                <w:rFonts w:ascii="Calibri" w:hAnsi="Calibri" w:eastAsia="Calibri"/>
-                <w:b w:val="0"/>
-                <w:sz w:val="20"/>
-              </w:rPr>
-              <w:t>Да</w:t>
-            </w:r>
-          </w:p>
-        </w:tc>
-        <w:tc>
-          <w:tcPr>
-            <w:tcW w:type="dxa" w:w="3324"/>
-          </w:tcPr>
-          <w:p>
-            <w:r/>
-            <w:r>
-              <w:rPr>
-                <w:rFonts w:ascii="Calibri" w:hAnsi="Calibri" w:eastAsia="Calibri"/>
-                <w:b w:val="0"/>
-                <w:sz w:val="20"/>
-              </w:rPr>
-              <w:t>Максимальный балл за задание.</w:t>
-            </w:r>
-          </w:p>
-        </w:tc>
-      </w:tr>
-      <w:tr>
-        <w:tc>
-          <w:tcPr>
-            <w:tcW w:type="dxa" w:w="3324"/>
-          </w:tcPr>
-          <w:p>
-            <w:r/>
-            <w:r>
-              <w:rPr>
-                <w:rFonts w:ascii="Calibri" w:hAnsi="Calibri" w:eastAsia="Calibri"/>
-                <w:b w:val="0"/>
-                <w:sz w:val="20"/>
-              </w:rPr>
-              <w:t>Дополнительно → Закрытый</w:t>
-            </w:r>
-          </w:p>
-        </w:tc>
-        <w:tc>
-          <w:tcPr>
-            <w:tcW w:type="dxa" w:w="3324"/>
-          </w:tcPr>
-          <w:p>
-            <w:r/>
-            <w:r>
-              <w:rPr>
-                <w:rFonts w:ascii="Calibri" w:hAnsi="Calibri" w:eastAsia="Calibri"/>
-                <w:b w:val="0"/>
-                <w:sz w:val="20"/>
-              </w:rPr>
-              <w:t>Нет</w:t>
-            </w:r>
-          </w:p>
-        </w:tc>
-        <w:tc>
-          <w:tcPr>
-            <w:tcW w:type="dxa" w:w="3324"/>
-          </w:tcPr>
-          <w:p>
-            <w:r/>
-            <w:r>
-              <w:rPr>
-                <w:rFonts w:ascii="Calibri" w:hAnsi="Calibri" w:eastAsia="Calibri"/>
-                <w:b w:val="0"/>
-                <w:sz w:val="20"/>
-              </w:rPr>
-              <w:t>Если включено, тема закрыта для студентов.</w:t>
-            </w:r>
-          </w:p>
-        </w:tc>
-      </w:tr>
-    </w:tbl>
-    <w:p/>
+    <w:p>
+      <w:pPr>
+        <w:spacing w:after="160" w:before="0"/>
+      </w:pPr>
+      <w:r>
+        <w:rPr>
+          <w:rFonts w:ascii="Calibri" w:hAnsi="Calibri" w:eastAsia="Calibri"/>
+          <w:b w:val="0"/>
+          <w:i w:val="0"/>
+          <w:sz w:val="22"/>
+        </w:rPr>
+        <w:t>Лекции, практика, лабораторные, СРС, РГЗ/РП: неделя 1–16, баллы, срок доступа и опция «Закрытый». Для силлабуса, глоссария, литературы и «другое» баллы скрыты.</w:t>
+      </w:r>
+    </w:p>
     <w:p>
       <w:pPr>
         <w:jc w:val="center"/>
@@ -1820,7 +1365,7 @@
               <a:graphicData uri="http://schemas.openxmlformats.org/drawingml/2006/picture">
                 <pic:pic>
                   <pic:nvPicPr>
-                    <pic:cNvPr id="0" name="11-add-theme-lecture.png"/>
+                    <pic:cNvPr id="0" name="15-add-theme-lecture.png"/>
                     <pic:cNvPicPr/>
                   </pic:nvPicPr>
                   <pic:blipFill>
@@ -1855,7 +1400,20 @@
           <w:color w:val="5A5A5A"/>
           <w:sz w:val="18"/>
         </w:rPr>
-        <w:t>Рисунок 9. Пример: тип «Лекционное занятие»</w:t>
+        <w:t>Рисунок 9. Тип «Лекционные материалы»</w:t>
+      </w:r>
+    </w:p>
+    <w:p>
+      <w:pPr>
+        <w:pStyle w:val="Heading2"/>
+      </w:pPr>
+      <w:r>
+        <w:rPr>
+          <w:rFonts w:ascii="Calibri" w:hAnsi="Calibri" w:eastAsia="Calibri"/>
+          <w:b/>
+          <w:sz w:val="28"/>
+        </w:rPr>
+        <w:t>Тип «Тесты»</w:t>
       </w:r>
     </w:p>
     <w:p>
@@ -1869,34 +1427,7 @@
           <w:i w:val="0"/>
           <w:sz w:val="22"/>
         </w:rPr>
-        <w:t>После заполнения нажмите «Добавить задание».</w:t>
-      </w:r>
-    </w:p>
-    <w:p>
-      <w:pPr>
-        <w:pStyle w:val="Heading2"/>
-      </w:pPr>
-      <w:r>
-        <w:rPr>
-          <w:rFonts w:ascii="Calibri" w:hAnsi="Calibri" w:eastAsia="Calibri"/>
-          <w:b/>
-          <w:sz w:val="28"/>
-        </w:rPr>
-        <w:t>Если выбран тип «Тест»</w:t>
-      </w:r>
-    </w:p>
-    <w:p>
-      <w:pPr>
-        <w:spacing w:after="160" w:before="0"/>
-      </w:pPr>
-      <w:r>
-        <w:rPr>
-          <w:rFonts w:ascii="Calibri" w:hAnsi="Calibri" w:eastAsia="Calibri"/>
-          <w:b w:val="0"/>
-          <w:i w:val="0"/>
-          <w:sz w:val="22"/>
-        </w:rPr>
-        <w:t>Поля недели, названия и баллов скрываются. Нужно выбрать уже созданный тест и привязать его к курсу.</w:t>
+        <w:t>Нужно выбрать уже созданный тест из раздела «Тестирование» и привязать его к курсу.</w:t>
       </w:r>
     </w:p>
     <w:p>
@@ -1915,7 +1446,7 @@
               <a:graphicData uri="http://schemas.openxmlformats.org/drawingml/2006/picture">
                 <pic:pic>
                   <pic:nvPicPr>
-                    <pic:cNvPr id="0" name="12-add-theme-test.png"/>
+                    <pic:cNvPr id="0" name="16-add-theme-test.png"/>
                     <pic:cNvPicPr/>
                   </pic:nvPicPr>
                   <pic:blipFill>
@@ -1950,7 +1481,7 @@
           <w:color w:val="5A5A5A"/>
           <w:sz w:val="18"/>
         </w:rPr>
-        <w:t>Рисунок 10. Тип «Тест»: выбор готового теста</w:t>
+        <w:t>Рисунок 10. Выбор готового теста</w:t>
       </w:r>
     </w:p>
     <w:p>
@@ -1965,7 +1496,7 @@
           <w:color w:val="92400E"/>
           <w:sz w:val="22"/>
         </w:rPr>
-        <w:t>Если написано «Нет доступных тестов», сначала создайте тест в разделе «Тестирование», затем вернитесь в курс и снова выберите тип «Тест».</w:t>
+        <w:t>Если теста нет в списке, сначала создайте его в «Тестировании».</w:t>
       </w:r>
     </w:p>
     <w:p>
@@ -1978,7 +1509,7 @@
           <w:b/>
           <w:sz w:val="36"/>
         </w:rPr>
-        <w:t>6. Как создать тест</w:t>
+        <w:t>7. Работа с выбранной темой</w:t>
       </w:r>
     </w:p>
     <w:p>
@@ -1992,46 +1523,7 @@
           <w:i w:val="0"/>
           <w:sz w:val="22"/>
         </w:rPr>
-        <w:t>Тест создаётся отдельно, в разделе «Тестирование». После этого его можно привязать к курсу.</w:t>
-      </w:r>
-    </w:p>
-    <w:p>
-      <w:pPr>
-        <w:pStyle w:val="ListNumber"/>
-      </w:pPr>
-      <w:r>
-        <w:rPr>
-          <w:rFonts w:ascii="Calibri" w:hAnsi="Calibri" w:eastAsia="Calibri"/>
-          <w:b w:val="0"/>
-          <w:sz w:val="22"/>
-        </w:rPr>
-        <w:t>В верхнем меню нажмите «Тестирование».</w:t>
-      </w:r>
-    </w:p>
-    <w:p>
-      <w:pPr>
-        <w:pStyle w:val="ListNumber"/>
-      </w:pPr>
-      <w:r>
-        <w:rPr>
-          <w:rFonts w:ascii="Calibri" w:hAnsi="Calibri" w:eastAsia="Calibri"/>
-          <w:b w:val="0"/>
-          <w:sz w:val="22"/>
-        </w:rPr>
-        <w:t>Откроется страница «Мои тесты».</w:t>
-      </w:r>
-    </w:p>
-    <w:p>
-      <w:pPr>
-        <w:pStyle w:val="ListNumber"/>
-      </w:pPr>
-      <w:r>
-        <w:rPr>
-          <w:rFonts w:ascii="Calibri" w:hAnsi="Calibri" w:eastAsia="Calibri"/>
-          <w:b w:val="0"/>
-          <w:sz w:val="22"/>
-        </w:rPr>
-        <w:t>Нажмите карточку «Добавьте новый тест».</w:t>
+        <w:t>Нажмите тему слева. Справа — материалы, доступ студентов, ответы и обсуждение. Точечный доступ задаётся здесь, массовый — в «Управлении курсом».</w:t>
       </w:r>
     </w:p>
     <w:p>
@@ -2050,7 +1542,7 @@
               <a:graphicData uri="http://schemas.openxmlformats.org/drawingml/2006/picture">
                 <pic:pic>
                   <pic:nvPicPr>
-                    <pic:cNvPr id="0" name="15-my-tests.png"/>
+                    <pic:cNvPr id="0" name="08-theme-selected.png"/>
                     <pic:cNvPicPr/>
                   </pic:nvPicPr>
                   <pic:blipFill>
@@ -2085,7 +1577,20 @@
           <w:color w:val="5A5A5A"/>
           <w:sz w:val="18"/>
         </w:rPr>
-        <w:t>Рисунок 11. Раздел «Мои тесты»</w:t>
+        <w:t>Рисунок 11. Тема выбрана</w:t>
+      </w:r>
+    </w:p>
+    <w:p>
+      <w:pPr>
+        <w:pStyle w:val="Heading1"/>
+      </w:pPr>
+      <w:r>
+        <w:rPr>
+          <w:rFonts w:ascii="Calibri" w:hAnsi="Calibri" w:eastAsia="Calibri"/>
+          <w:b/>
+          <w:sz w:val="36"/>
+        </w:rPr>
+        <w:t>8. Учебные материалы</w:t>
       </w:r>
     </w:p>
     <w:p>
@@ -2099,7 +1604,7 @@
           <w:i w:val="0"/>
           <w:sz w:val="22"/>
         </w:rPr>
-        <w:t>Откроется страница «Создание теста по усвоению материала».</w:t>
+        <w:t>Нажмите «Добавить материал» или перетащите файл. Допускаются PDF и изображения (лучше PDF). Файл и ссылка взаимоисключающие. Все файлы курса также во вкладке «Материалы».</w:t>
       </w:r>
     </w:p>
     <w:p>
@@ -2118,7 +1623,7 @@
               <a:graphicData uri="http://schemas.openxmlformats.org/drawingml/2006/picture">
                 <pic:pic>
                   <pic:nvPicPr>
-                    <pic:cNvPr id="0" name="18-add-quiz-header.png"/>
+                    <pic:cNvPr id="0" name="09-add-material.png"/>
                     <pic:cNvPicPr/>
                   </pic:nvPicPr>
                   <pic:blipFill>
@@ -2153,20 +1658,426 @@
           <w:color w:val="5A5A5A"/>
           <w:sz w:val="18"/>
         </w:rPr>
-        <w:t>Рисунок 12. Основные параметры теста</w:t>
+        <w:t>Рисунок 12. Загрузка материала</w:t>
       </w:r>
     </w:p>
     <w:p>
       <w:pPr>
-        <w:pStyle w:val="Heading2"/>
+        <w:jc w:val="center"/>
+      </w:pPr>
+      <w:r>
+        <w:drawing>
+          <wp:inline xmlns:a="http://schemas.openxmlformats.org/drawingml/2006/main" xmlns:pic="http://schemas.openxmlformats.org/drawingml/2006/picture">
+            <wp:extent cx="5688000" cy="3555000"/>
+            <wp:docPr id="13" name="Picture 13"/>
+            <wp:cNvGraphicFramePr>
+              <a:graphicFrameLocks noChangeAspect="1"/>
+            </wp:cNvGraphicFramePr>
+            <a:graphic>
+              <a:graphicData uri="http://schemas.openxmlformats.org/drawingml/2006/picture">
+                <pic:pic>
+                  <pic:nvPicPr>
+                    <pic:cNvPr id="0" name="11-course-files.png"/>
+                    <pic:cNvPicPr/>
+                  </pic:nvPicPr>
+                  <pic:blipFill>
+                    <a:blip r:embed="rId21"/>
+                    <a:stretch>
+                      <a:fillRect/>
+                    </a:stretch>
+                  </pic:blipFill>
+                  <pic:spPr>
+                    <a:xfrm>
+                      <a:off x="0" y="0"/>
+                      <a:ext cx="5688000" cy="3555000"/>
+                    </a:xfrm>
+                    <a:prstGeom prst="rect"/>
+                  </pic:spPr>
+                </pic:pic>
+              </a:graphicData>
+            </a:graphic>
+          </wp:inline>
+        </w:drawing>
+      </w:r>
+    </w:p>
+    <w:p>
+      <w:pPr>
+        <w:spacing w:after="240"/>
+        <w:jc w:val="center"/>
+      </w:pPr>
+      <w:r>
+        <w:rPr>
+          <w:rFonts w:ascii="Calibri" w:hAnsi="Calibri" w:eastAsia="Calibri"/>
+          <w:b w:val="0"/>
+          <w:color w:val="5A5A5A"/>
+          <w:sz w:val="18"/>
+        </w:rPr>
+        <w:t>Рисунок 13. Сводный список файлов</w:t>
+      </w:r>
+    </w:p>
+    <w:p>
+      <w:pPr>
+        <w:pStyle w:val="Heading1"/>
       </w:pPr>
       <w:r>
         <w:rPr>
           <w:rFonts w:ascii="Calibri" w:hAnsi="Calibri" w:eastAsia="Calibri"/>
           <w:b/>
-          <w:sz w:val="28"/>
+          <w:sz w:val="36"/>
         </w:rPr>
-        <w:t>Параметры теста</w:t>
+        <w:t>9. Приглашение студентов</w:t>
+      </w:r>
+    </w:p>
+    <w:p>
+      <w:pPr>
+        <w:spacing w:after="160" w:before="0"/>
+      </w:pPr>
+      <w:r>
+        <w:rPr>
+          <w:rFonts w:ascii="Calibri" w:hAnsi="Calibri" w:eastAsia="Calibri"/>
+          <w:b w:val="0"/>
+          <w:i w:val="0"/>
+          <w:sz w:val="22"/>
+        </w:rPr>
+        <w:t>Иконка QR рядом с названием курса. Создайте приглашение и выберите срок. Чтобы курс увидела учебная группа, добавьте поток в «Управлении курсом».</w:t>
+      </w:r>
+    </w:p>
+    <w:p>
+      <w:pPr>
+        <w:jc w:val="center"/>
+      </w:pPr>
+      <w:r>
+        <w:drawing>
+          <wp:inline xmlns:a="http://schemas.openxmlformats.org/drawingml/2006/main" xmlns:pic="http://schemas.openxmlformats.org/drawingml/2006/picture">
+            <wp:extent cx="5688000" cy="3555000"/>
+            <wp:docPr id="14" name="Picture 14"/>
+            <wp:cNvGraphicFramePr>
+              <a:graphicFrameLocks noChangeAspect="1"/>
+            </wp:cNvGraphicFramePr>
+            <a:graphic>
+              <a:graphicData uri="http://schemas.openxmlformats.org/drawingml/2006/picture">
+                <pic:pic>
+                  <pic:nvPicPr>
+                    <pic:cNvPr id="0" name="13-invite.png"/>
+                    <pic:cNvPicPr/>
+                  </pic:nvPicPr>
+                  <pic:blipFill>
+                    <a:blip r:embed="rId22"/>
+                    <a:stretch>
+                      <a:fillRect/>
+                    </a:stretch>
+                  </pic:blipFill>
+                  <pic:spPr>
+                    <a:xfrm>
+                      <a:off x="0" y="0"/>
+                      <a:ext cx="5688000" cy="3555000"/>
+                    </a:xfrm>
+                    <a:prstGeom prst="rect"/>
+                  </pic:spPr>
+                </pic:pic>
+              </a:graphicData>
+            </a:graphic>
+          </wp:inline>
+        </w:drawing>
+      </w:r>
+    </w:p>
+    <w:p>
+      <w:pPr>
+        <w:spacing w:after="240"/>
+        <w:jc w:val="center"/>
+      </w:pPr>
+      <w:r>
+        <w:rPr>
+          <w:rFonts w:ascii="Calibri" w:hAnsi="Calibri" w:eastAsia="Calibri"/>
+          <w:b w:val="0"/>
+          <w:color w:val="5A5A5A"/>
+          <w:sz w:val="18"/>
+        </w:rPr>
+        <w:t>Рисунок 14. Диалог приглашения</w:t>
+      </w:r>
+    </w:p>
+    <w:p>
+      <w:pPr>
+        <w:pStyle w:val="Heading1"/>
+      </w:pPr>
+      <w:r>
+        <w:rPr>
+          <w:rFonts w:ascii="Calibri" w:hAnsi="Calibri" w:eastAsia="Calibri"/>
+          <w:b/>
+          <w:sz w:val="36"/>
+        </w:rPr>
+        <w:t>10. Успеваемость и управление курсом</w:t>
+      </w:r>
+    </w:p>
+    <w:p>
+      <w:pPr>
+        <w:spacing w:after="160" w:before="0"/>
+      </w:pPr>
+      <w:r>
+        <w:rPr>
+          <w:rFonts w:ascii="Calibri" w:hAnsi="Calibri" w:eastAsia="Calibri"/>
+          <w:b w:val="0"/>
+          <w:i w:val="0"/>
+          <w:sz w:val="22"/>
+        </w:rPr>
+        <w:t>Успеваемость: баллы, карточка студента, экспорт в Excel.</w:t>
+      </w:r>
+    </w:p>
+    <w:p>
+      <w:pPr>
+        <w:jc w:val="center"/>
+      </w:pPr>
+      <w:r>
+        <w:drawing>
+          <wp:inline xmlns:a="http://schemas.openxmlformats.org/drawingml/2006/main" xmlns:pic="http://schemas.openxmlformats.org/drawingml/2006/picture">
+            <wp:extent cx="5688000" cy="3555000"/>
+            <wp:docPr id="15" name="Picture 15"/>
+            <wp:cNvGraphicFramePr>
+              <a:graphicFrameLocks noChangeAspect="1"/>
+            </wp:cNvGraphicFramePr>
+            <a:graphic>
+              <a:graphicData uri="http://schemas.openxmlformats.org/drawingml/2006/picture">
+                <pic:pic>
+                  <pic:nvPicPr>
+                    <pic:cNvPr id="0" name="13-students-progress.png"/>
+                    <pic:cNvPicPr/>
+                  </pic:nvPicPr>
+                  <pic:blipFill>
+                    <a:blip r:embed="rId23"/>
+                    <a:stretch>
+                      <a:fillRect/>
+                    </a:stretch>
+                  </pic:blipFill>
+                  <pic:spPr>
+                    <a:xfrm>
+                      <a:off x="0" y="0"/>
+                      <a:ext cx="5688000" cy="3555000"/>
+                    </a:xfrm>
+                    <a:prstGeom prst="rect"/>
+                  </pic:spPr>
+                </pic:pic>
+              </a:graphicData>
+            </a:graphic>
+          </wp:inline>
+        </w:drawing>
+      </w:r>
+    </w:p>
+    <w:p>
+      <w:pPr>
+        <w:spacing w:after="240"/>
+        <w:jc w:val="center"/>
+      </w:pPr>
+      <w:r>
+        <w:rPr>
+          <w:rFonts w:ascii="Calibri" w:hAnsi="Calibri" w:eastAsia="Calibri"/>
+          <w:b w:val="0"/>
+          <w:color w:val="5A5A5A"/>
+          <w:sz w:val="18"/>
+        </w:rPr>
+        <w:t>Рисунок 15. Успеваемость</w:t>
+      </w:r>
+    </w:p>
+    <w:p>
+      <w:pPr>
+        <w:spacing w:after="160" w:before="0"/>
+      </w:pPr>
+      <w:r>
+        <w:rPr>
+          <w:rFonts w:ascii="Calibri" w:hAnsi="Calibri" w:eastAsia="Calibri"/>
+          <w:b w:val="0"/>
+          <w:i w:val="0"/>
+          <w:sz w:val="22"/>
+        </w:rPr>
+        <w:t>Управление: название и описание, открыть/закрыть доступ ко всем темам, потоки, кафедра, дублирование (без студентов) и удаление (нельзя, пока есть студенты).</w:t>
+      </w:r>
+    </w:p>
+    <w:p>
+      <w:pPr>
+        <w:jc w:val="center"/>
+      </w:pPr>
+      <w:r>
+        <w:drawing>
+          <wp:inline xmlns:a="http://schemas.openxmlformats.org/drawingml/2006/main" xmlns:pic="http://schemas.openxmlformats.org/drawingml/2006/picture">
+            <wp:extent cx="5688000" cy="3555000"/>
+            <wp:docPr id="16" name="Picture 16"/>
+            <wp:cNvGraphicFramePr>
+              <a:graphicFrameLocks noChangeAspect="1"/>
+            </wp:cNvGraphicFramePr>
+            <a:graphic>
+              <a:graphicData uri="http://schemas.openxmlformats.org/drawingml/2006/picture">
+                <pic:pic>
+                  <pic:nvPicPr>
+                    <pic:cNvPr id="0" name="14-course-management.png"/>
+                    <pic:cNvPicPr/>
+                  </pic:nvPicPr>
+                  <pic:blipFill>
+                    <a:blip r:embed="rId24"/>
+                    <a:stretch>
+                      <a:fillRect/>
+                    </a:stretch>
+                  </pic:blipFill>
+                  <pic:spPr>
+                    <a:xfrm>
+                      <a:off x="0" y="0"/>
+                      <a:ext cx="5688000" cy="3555000"/>
+                    </a:xfrm>
+                    <a:prstGeom prst="rect"/>
+                  </pic:spPr>
+                </pic:pic>
+              </a:graphicData>
+            </a:graphic>
+          </wp:inline>
+        </w:drawing>
+      </w:r>
+    </w:p>
+    <w:p>
+      <w:pPr>
+        <w:spacing w:after="240"/>
+        <w:jc w:val="center"/>
+      </w:pPr>
+      <w:r>
+        <w:rPr>
+          <w:rFonts w:ascii="Calibri" w:hAnsi="Calibri" w:eastAsia="Calibri"/>
+          <w:b w:val="0"/>
+          <w:color w:val="5A5A5A"/>
+          <w:sz w:val="18"/>
+        </w:rPr>
+        <w:t>Рисунок 16. Управление курсом</w:t>
+      </w:r>
+    </w:p>
+    <w:p>
+      <w:pPr>
+        <w:pStyle w:val="Heading1"/>
+      </w:pPr>
+      <w:r>
+        <w:rPr>
+          <w:rFonts w:ascii="Calibri" w:hAnsi="Calibri" w:eastAsia="Calibri"/>
+          <w:b/>
+          <w:sz w:val="36"/>
+        </w:rPr>
+        <w:t>11. Как создать тест</w:t>
+      </w:r>
+    </w:p>
+    <w:p>
+      <w:pPr>
+        <w:spacing w:after="160" w:before="0"/>
+      </w:pPr>
+      <w:r>
+        <w:rPr>
+          <w:rFonts w:ascii="Calibri" w:hAnsi="Calibri" w:eastAsia="Calibri"/>
+          <w:b w:val="0"/>
+          <w:i w:val="0"/>
+          <w:sz w:val="22"/>
+        </w:rPr>
+        <w:t>Тест создаётся в «Тестировании», затем привязывается к курсу типом «Тесты».</w:t>
+      </w:r>
+    </w:p>
+    <w:p>
+      <w:pPr>
+        <w:jc w:val="center"/>
+      </w:pPr>
+      <w:r>
+        <w:drawing>
+          <wp:inline xmlns:a="http://schemas.openxmlformats.org/drawingml/2006/main" xmlns:pic="http://schemas.openxmlformats.org/drawingml/2006/picture">
+            <wp:extent cx="5688000" cy="3555000"/>
+            <wp:docPr id="17" name="Picture 17"/>
+            <wp:cNvGraphicFramePr>
+              <a:graphicFrameLocks noChangeAspect="1"/>
+            </wp:cNvGraphicFramePr>
+            <a:graphic>
+              <a:graphicData uri="http://schemas.openxmlformats.org/drawingml/2006/picture">
+                <pic:pic>
+                  <pic:nvPicPr>
+                    <pic:cNvPr id="0" name="14-my-tests.png"/>
+                    <pic:cNvPicPr/>
+                  </pic:nvPicPr>
+                  <pic:blipFill>
+                    <a:blip r:embed="rId25"/>
+                    <a:stretch>
+                      <a:fillRect/>
+                    </a:stretch>
+                  </pic:blipFill>
+                  <pic:spPr>
+                    <a:xfrm>
+                      <a:off x="0" y="0"/>
+                      <a:ext cx="5688000" cy="3555000"/>
+                    </a:xfrm>
+                    <a:prstGeom prst="rect"/>
+                  </pic:spPr>
+                </pic:pic>
+              </a:graphicData>
+            </a:graphic>
+          </wp:inline>
+        </w:drawing>
+      </w:r>
+    </w:p>
+    <w:p>
+      <w:pPr>
+        <w:spacing w:after="240"/>
+        <w:jc w:val="center"/>
+      </w:pPr>
+      <w:r>
+        <w:rPr>
+          <w:rFonts w:ascii="Calibri" w:hAnsi="Calibri" w:eastAsia="Calibri"/>
+          <w:b w:val="0"/>
+          <w:color w:val="5A5A5A"/>
+          <w:sz w:val="18"/>
+        </w:rPr>
+        <w:t>Рисунок 17. Мои тесты</w:t>
+      </w:r>
+    </w:p>
+    <w:p>
+      <w:pPr>
+        <w:jc w:val="center"/>
+      </w:pPr>
+      <w:r>
+        <w:drawing>
+          <wp:inline xmlns:a="http://schemas.openxmlformats.org/drawingml/2006/main" xmlns:pic="http://schemas.openxmlformats.org/drawingml/2006/picture">
+            <wp:extent cx="5688000" cy="3555000"/>
+            <wp:docPr id="18" name="Picture 18"/>
+            <wp:cNvGraphicFramePr>
+              <a:graphicFrameLocks noChangeAspect="1"/>
+            </wp:cNvGraphicFramePr>
+            <a:graphic>
+              <a:graphicData uri="http://schemas.openxmlformats.org/drawingml/2006/picture">
+                <pic:pic>
+                  <pic:nvPicPr>
+                    <pic:cNvPr id="0" name="15-add-quiz.png"/>
+                    <pic:cNvPicPr/>
+                  </pic:nvPicPr>
+                  <pic:blipFill>
+                    <a:blip r:embed="rId26"/>
+                    <a:stretch>
+                      <a:fillRect/>
+                    </a:stretch>
+                  </pic:blipFill>
+                  <pic:spPr>
+                    <a:xfrm>
+                      <a:off x="0" y="0"/>
+                      <a:ext cx="5688000" cy="3555000"/>
+                    </a:xfrm>
+                    <a:prstGeom prst="rect"/>
+                  </pic:spPr>
+                </pic:pic>
+              </a:graphicData>
+            </a:graphic>
+          </wp:inline>
+        </w:drawing>
+      </w:r>
+    </w:p>
+    <w:p>
+      <w:pPr>
+        <w:spacing w:after="240"/>
+        <w:jc w:val="center"/>
+      </w:pPr>
+      <w:r>
+        <w:rPr>
+          <w:rFonts w:ascii="Calibri" w:hAnsi="Calibri" w:eastAsia="Calibri"/>
+          <w:b w:val="0"/>
+          <w:color w:val="5A5A5A"/>
+          <w:sz w:val="18"/>
+        </w:rPr>
+        <w:t>Рисунок 18. Параметры нового теста</w:t>
       </w:r>
     </w:p>
     <w:tbl>
@@ -2275,7 +2186,7 @@
                 <w:b w:val="0"/>
                 <w:sz w:val="20"/>
               </w:rPr>
-              <w:t>Как тест отображается студентам и в списке «Мои тесты».</w:t>
+              <w:t>Как тест виден студентам.</w:t>
             </w:r>
           </w:p>
         </w:tc>
@@ -2309,7 +2220,7 @@
                 <w:b w:val="0"/>
                 <w:sz w:val="20"/>
               </w:rPr>
-              <w:t>Да</w:t>
+              <w:t>Нет</w:t>
             </w:r>
           </w:p>
         </w:tc>
@@ -2325,7 +2236,7 @@
                 <w:b w:val="0"/>
                 <w:sz w:val="20"/>
               </w:rPr>
-              <w:t>Для чего тест и что проверяется.</w:t>
+              <w:t>Что проверяет тест.</w:t>
             </w:r>
           </w:p>
         </w:tc>
@@ -2343,7 +2254,7 @@
                 <w:b w:val="0"/>
                 <w:sz w:val="20"/>
               </w:rPr>
-              <w:t>Время на прохождение (в минутах)</w:t>
+              <w:t>Время, мин</w:t>
             </w:r>
           </w:p>
         </w:tc>
@@ -2375,7 +2286,7 @@
                 <w:b w:val="0"/>
                 <w:sz w:val="20"/>
               </w:rPr>
-              <w:t>Лимит времени. Минимум 1 минута.</w:t>
+              <w:t>Минимум 1 минута.</w:t>
             </w:r>
           </w:p>
         </w:tc>
@@ -2393,7 +2304,7 @@
                 <w:b w:val="0"/>
                 <w:sz w:val="20"/>
               </w:rPr>
-              <w:t>Максимальное количество баллов</w:t>
+              <w:t>Макс. балл</w:t>
             </w:r>
           </w:p>
         </w:tc>
@@ -2443,7 +2354,7 @@
                 <w:b w:val="0"/>
                 <w:sz w:val="20"/>
               </w:rPr>
-              <w:t>Минимальный балл</w:t>
+              <w:t>Мин. балл для сдачи</w:t>
             </w:r>
           </w:p>
         </w:tc>
@@ -2475,7 +2386,7 @@
                 <w:b w:val="0"/>
                 <w:sz w:val="20"/>
               </w:rPr>
-              <w:t>Порог прохождения. Не больше максимума.</w:t>
+              <w:t>Не больше максимума.</w:t>
             </w:r>
           </w:p>
         </w:tc>
@@ -2493,7 +2404,57 @@
                 <w:b w:val="0"/>
                 <w:sz w:val="20"/>
               </w:rPr>
-              <w:t>Показывать правильные ответы после отправки</w:t>
+              <w:t>Вопросов студенту</w:t>
+            </w:r>
+          </w:p>
+        </w:tc>
+        <w:tc>
+          <w:tcPr>
+            <w:tcW w:type="dxa" w:w="3324"/>
+          </w:tcPr>
+          <w:p>
+            <w:r/>
+            <w:r>
+              <w:rPr>
+                <w:rFonts w:ascii="Calibri" w:hAnsi="Calibri" w:eastAsia="Calibri"/>
+                <w:b w:val="0"/>
+                <w:sz w:val="20"/>
+              </w:rPr>
+              <w:t>Да</w:t>
+            </w:r>
+          </w:p>
+        </w:tc>
+        <w:tc>
+          <w:tcPr>
+            <w:tcW w:type="dxa" w:w="3324"/>
+          </w:tcPr>
+          <w:p>
+            <w:r/>
+            <w:r>
+              <w:rPr>
+                <w:rFonts w:ascii="Calibri" w:hAnsi="Calibri" w:eastAsia="Calibri"/>
+                <w:b w:val="0"/>
+                <w:sz w:val="20"/>
+              </w:rPr>
+              <w:t>Случайно из пула, не больше числа вопросов.</w:t>
+            </w:r>
+          </w:p>
+        </w:tc>
+      </w:tr>
+      <w:tr>
+        <w:tc>
+          <w:tcPr>
+            <w:tcW w:type="dxa" w:w="3324"/>
+          </w:tcPr>
+          <w:p>
+            <w:r/>
+            <w:r>
+              <w:rPr>
+                <w:rFonts w:ascii="Calibri" w:hAnsi="Calibri" w:eastAsia="Calibri"/>
+                <w:b w:val="0"/>
+                <w:sz w:val="20"/>
+              </w:rPr>
+              <w:t>Обязательный</w:t>
             </w:r>
           </w:p>
         </w:tc>
@@ -2525,7 +2486,7 @@
                 <w:b w:val="0"/>
                 <w:sz w:val="20"/>
               </w:rPr>
-              <w:t>Студент увидит верные ответы после сдачи.</w:t>
+              <w:t>Для выставления балла нужно пройти тест.</w:t>
             </w:r>
           </w:p>
         </w:tc>
@@ -2543,7 +2504,7 @@
                 <w:b w:val="0"/>
                 <w:sz w:val="20"/>
               </w:rPr>
-              <w:t>Дополнительно → Обязательный</w:t>
+              <w:t>Показывать ответы</w:t>
             </w:r>
           </w:p>
         </w:tc>
@@ -2575,26 +2536,13 @@
                 <w:b w:val="0"/>
                 <w:sz w:val="20"/>
               </w:rPr>
-              <w:t>Для выставления балла нужно пройти этот тест.</w:t>
+              <w:t>После сдачи видны верные ответы.</w:t>
             </w:r>
           </w:p>
         </w:tc>
       </w:tr>
     </w:tbl>
     <w:p/>
-    <w:p>
-      <w:pPr>
-        <w:pStyle w:val="Heading2"/>
-      </w:pPr>
-      <w:r>
-        <w:rPr>
-          <w:rFonts w:ascii="Calibri" w:hAnsi="Calibri" w:eastAsia="Calibri"/>
-          <w:b/>
-          <w:sz w:val="28"/>
-        </w:rPr>
-        <w:t>Вопросы и варианты ответов</w:t>
-      </w:r>
-    </w:p>
     <w:p>
       <w:pPr>
         <w:spacing w:after="160" w:before="0"/>
@@ -2606,7 +2554,7 @@
           <w:i w:val="0"/>
           <w:sz w:val="22"/>
         </w:rPr>
-        <w:t>По умолчанию есть два вопроса. Можно добавить до четырёх вопросов и до шести вариантов ответа на вопрос.</w:t>
+        <w:t>Типы вопросов: один вариант, несколько, да/нет, короткий ответ, эссе. Готовые вопросы вставляются кнопкой «Из коллекции вопросов».</w:t>
       </w:r>
     </w:p>
     <w:p>
@@ -2617,7 +2565,7 @@
         <w:drawing>
           <wp:inline xmlns:a="http://schemas.openxmlformats.org/drawingml/2006/main" xmlns:pic="http://schemas.openxmlformats.org/drawingml/2006/picture">
             <wp:extent cx="5688000" cy="3555000"/>
-            <wp:docPr id="13" name="Picture 13"/>
+            <wp:docPr id="19" name="Picture 19"/>
             <wp:cNvGraphicFramePr>
               <a:graphicFrameLocks noChangeAspect="1"/>
             </wp:cNvGraphicFramePr>
@@ -2625,11 +2573,11 @@
               <a:graphicData uri="http://schemas.openxmlformats.org/drawingml/2006/picture">
                 <pic:pic>
                   <pic:nvPicPr>
-                    <pic:cNvPr id="0" name="17-add-quiz-questions.png"/>
+                    <pic:cNvPr id="0" name="16-add-quiz-questions.png"/>
                     <pic:cNvPicPr/>
                   </pic:nvPicPr>
                   <pic:blipFill>
-                    <a:blip r:embed="rId21"/>
+                    <a:blip r:embed="rId27"/>
                     <a:stretch>
                       <a:fillRect/>
                     </a:stretch>
@@ -2660,293 +2608,88 @@
           <w:color w:val="5A5A5A"/>
           <w:sz w:val="18"/>
         </w:rPr>
-        <w:t>Рисунок 13. Вопрос, варианты ответов и правильный ответ</w:t>
+        <w:t>Рисунок 19. Карточка вопроса</w:t>
       </w:r>
     </w:p>
-    <w:tbl>
-      <w:tblPr>
-        <w:tblStyle w:val="TableGrid"/>
-        <w:tblW w:type="auto" w:w="0"/>
-        <w:tblLook w:firstColumn="1" w:firstRow="1" w:lastColumn="0" w:lastRow="0" w:noHBand="0" w:noVBand="1" w:val="04A0"/>
-      </w:tblPr>
-      <w:tblGrid>
-        <w:gridCol w:w="4986"/>
-        <w:gridCol w:w="4986"/>
-      </w:tblGrid>
-      <w:tr>
-        <w:tc>
-          <w:tcPr>
-            <w:tcW w:type="dxa" w:w="4986"/>
-          </w:tcPr>
-          <w:p>
-            <w:r/>
-            <w:r>
-              <w:rPr>
-                <w:rFonts w:ascii="Calibri" w:hAnsi="Calibri" w:eastAsia="Calibri"/>
-                <w:b/>
-                <w:sz w:val="20"/>
-              </w:rPr>
-              <w:t>Элемент</w:t>
-            </w:r>
-          </w:p>
-        </w:tc>
-        <w:tc>
-          <w:tcPr>
-            <w:tcW w:type="dxa" w:w="4986"/>
-          </w:tcPr>
-          <w:p>
-            <w:r/>
-            <w:r>
-              <w:rPr>
-                <w:rFonts w:ascii="Calibri" w:hAnsi="Calibri" w:eastAsia="Calibri"/>
-                <w:b/>
-                <w:sz w:val="20"/>
-              </w:rPr>
-              <w:t>Как использовать</w:t>
-            </w:r>
-          </w:p>
-        </w:tc>
-      </w:tr>
-      <w:tr>
-        <w:tc>
-          <w:tcPr>
-            <w:tcW w:type="dxa" w:w="4986"/>
-          </w:tcPr>
-          <w:p>
-            <w:r/>
-            <w:r>
-              <w:rPr>
-                <w:rFonts w:ascii="Calibri" w:hAnsi="Calibri" w:eastAsia="Calibri"/>
-                <w:b w:val="0"/>
-                <w:sz w:val="20"/>
-              </w:rPr>
-              <w:t>Текст вопроса</w:t>
-            </w:r>
-          </w:p>
-        </w:tc>
-        <w:tc>
-          <w:tcPr>
-            <w:tcW w:type="dxa" w:w="4986"/>
-          </w:tcPr>
-          <w:p>
-            <w:r/>
-            <w:r>
-              <w:rPr>
-                <w:rFonts w:ascii="Calibri" w:hAnsi="Calibri" w:eastAsia="Calibri"/>
-                <w:b w:val="0"/>
-                <w:sz w:val="20"/>
-              </w:rPr>
-              <w:t>Введите формулировку вопроса.</w:t>
-            </w:r>
-          </w:p>
-        </w:tc>
-      </w:tr>
-      <w:tr>
-        <w:tc>
-          <w:tcPr>
-            <w:tcW w:type="dxa" w:w="4986"/>
-          </w:tcPr>
-          <w:p>
-            <w:r/>
-            <w:r>
-              <w:rPr>
-                <w:rFonts w:ascii="Calibri" w:hAnsi="Calibri" w:eastAsia="Calibri"/>
-                <w:b w:val="0"/>
-                <w:sz w:val="20"/>
-              </w:rPr>
-              <w:t>Изображение для вопроса</w:t>
-            </w:r>
-          </w:p>
-        </w:tc>
-        <w:tc>
-          <w:tcPr>
-            <w:tcW w:type="dxa" w:w="4986"/>
-          </w:tcPr>
-          <w:p>
-            <w:r/>
-            <w:r>
-              <w:rPr>
-                <w:rFonts w:ascii="Calibri" w:hAnsi="Calibri" w:eastAsia="Calibri"/>
-                <w:b w:val="0"/>
-                <w:sz w:val="20"/>
-              </w:rPr>
-              <w:t>Необязательно. Можно прикрепить рисунок или схему.</w:t>
-            </w:r>
-          </w:p>
-        </w:tc>
-      </w:tr>
-      <w:tr>
-        <w:tc>
-          <w:tcPr>
-            <w:tcW w:type="dxa" w:w="4986"/>
-          </w:tcPr>
-          <w:p>
-            <w:r/>
-            <w:r>
-              <w:rPr>
-                <w:rFonts w:ascii="Calibri" w:hAnsi="Calibri" w:eastAsia="Calibri"/>
-                <w:b w:val="0"/>
-                <w:sz w:val="20"/>
-              </w:rPr>
-              <w:t>Несколько правильных ответов</w:t>
-            </w:r>
-          </w:p>
-        </w:tc>
-        <w:tc>
-          <w:tcPr>
-            <w:tcW w:type="dxa" w:w="4986"/>
-          </w:tcPr>
-          <w:p>
-            <w:r/>
-            <w:r>
-              <w:rPr>
-                <w:rFonts w:ascii="Calibri" w:hAnsi="Calibri" w:eastAsia="Calibri"/>
-                <w:b w:val="0"/>
-                <w:sz w:val="20"/>
-              </w:rPr>
-              <w:t>Включите, если верных вариантов больше одного.</w:t>
-            </w:r>
-          </w:p>
-        </w:tc>
-      </w:tr>
-      <w:tr>
-        <w:tc>
-          <w:tcPr>
-            <w:tcW w:type="dxa" w:w="4986"/>
-          </w:tcPr>
-          <w:p>
-            <w:r/>
-            <w:r>
-              <w:rPr>
-                <w:rFonts w:ascii="Calibri" w:hAnsi="Calibri" w:eastAsia="Calibri"/>
-                <w:b w:val="0"/>
-                <w:sz w:val="20"/>
-              </w:rPr>
-              <w:t>Вариант 1, Вариант 2…</w:t>
-            </w:r>
-          </w:p>
-        </w:tc>
-        <w:tc>
-          <w:tcPr>
-            <w:tcW w:type="dxa" w:w="4986"/>
-          </w:tcPr>
-          <w:p>
-            <w:r/>
-            <w:r>
-              <w:rPr>
-                <w:rFonts w:ascii="Calibri" w:hAnsi="Calibri" w:eastAsia="Calibri"/>
-                <w:b w:val="0"/>
-                <w:sz w:val="20"/>
-              </w:rPr>
-              <w:t>Текст ответа. К варианту тоже можно добавить изображение.</w:t>
-            </w:r>
-          </w:p>
-        </w:tc>
-      </w:tr>
-      <w:tr>
-        <w:tc>
-          <w:tcPr>
-            <w:tcW w:type="dxa" w:w="4986"/>
-          </w:tcPr>
-          <w:p>
-            <w:r/>
-            <w:r>
-              <w:rPr>
-                <w:rFonts w:ascii="Calibri" w:hAnsi="Calibri" w:eastAsia="Calibri"/>
-                <w:b w:val="0"/>
-                <w:sz w:val="20"/>
-              </w:rPr>
-              <w:t>Добавить вариант</w:t>
-            </w:r>
-          </w:p>
-        </w:tc>
-        <w:tc>
-          <w:tcPr>
-            <w:tcW w:type="dxa" w:w="4986"/>
-          </w:tcPr>
-          <w:p>
-            <w:r/>
-            <w:r>
-              <w:rPr>
-                <w:rFonts w:ascii="Calibri" w:hAnsi="Calibri" w:eastAsia="Calibri"/>
-                <w:b w:val="0"/>
-                <w:sz w:val="20"/>
-              </w:rPr>
-              <w:t>Добавляет ещё один вариант (максимум 6).</w:t>
-            </w:r>
-          </w:p>
-        </w:tc>
-      </w:tr>
-      <w:tr>
-        <w:tc>
-          <w:tcPr>
-            <w:tcW w:type="dxa" w:w="4986"/>
-          </w:tcPr>
-          <w:p>
-            <w:r/>
-            <w:r>
-              <w:rPr>
-                <w:rFonts w:ascii="Calibri" w:hAnsi="Calibri" w:eastAsia="Calibri"/>
-                <w:b w:val="0"/>
-                <w:sz w:val="20"/>
-              </w:rPr>
-              <w:t>Правильный ответ</w:t>
-            </w:r>
-          </w:p>
-        </w:tc>
-        <w:tc>
-          <w:tcPr>
-            <w:tcW w:type="dxa" w:w="4986"/>
-          </w:tcPr>
-          <w:p>
-            <w:r/>
-            <w:r>
-              <w:rPr>
-                <w:rFonts w:ascii="Calibri" w:hAnsi="Calibri" w:eastAsia="Calibri"/>
-                <w:b w:val="0"/>
-                <w:sz w:val="20"/>
-              </w:rPr>
-              <w:t>Выберите верный вариант или несколько, если включён множественный выбор.</w:t>
-            </w:r>
-          </w:p>
-        </w:tc>
-      </w:tr>
-      <w:tr>
-        <w:tc>
-          <w:tcPr>
-            <w:tcW w:type="dxa" w:w="4986"/>
-          </w:tcPr>
-          <w:p>
-            <w:r/>
-            <w:r>
-              <w:rPr>
-                <w:rFonts w:ascii="Calibri" w:hAnsi="Calibri" w:eastAsia="Calibri"/>
-                <w:b w:val="0"/>
-                <w:sz w:val="20"/>
-              </w:rPr>
-              <w:t>Добавить вопрос</w:t>
-            </w:r>
-          </w:p>
-        </w:tc>
-        <w:tc>
-          <w:tcPr>
-            <w:tcW w:type="dxa" w:w="4986"/>
-          </w:tcPr>
-          <w:p>
-            <w:r/>
-            <w:r>
-              <w:rPr>
-                <w:rFonts w:ascii="Calibri" w:hAnsi="Calibri" w:eastAsia="Calibri"/>
-                <w:b w:val="0"/>
-                <w:sz w:val="20"/>
-              </w:rPr>
-              <w:t>Добавляет следующий вопрос.</w:t>
-            </w:r>
-          </w:p>
-        </w:tc>
-      </w:tr>
-    </w:tbl>
-    <w:p/>
+    <w:p>
+      <w:pPr>
+        <w:pStyle w:val="ListNumber"/>
+      </w:pPr>
+      <w:r>
+        <w:rPr>
+          <w:rFonts w:ascii="Calibri" w:hAnsi="Calibri" w:eastAsia="Calibri"/>
+          <w:b w:val="0"/>
+          <w:sz w:val="22"/>
+        </w:rPr>
+        <w:t>Заполните параметры и вопросы.</w:t>
+      </w:r>
+    </w:p>
+    <w:p>
+      <w:pPr>
+        <w:pStyle w:val="ListNumber"/>
+      </w:pPr>
+      <w:r>
+        <w:rPr>
+          <w:rFonts w:ascii="Calibri" w:hAnsi="Calibri" w:eastAsia="Calibri"/>
+          <w:b w:val="0"/>
+          <w:sz w:val="22"/>
+        </w:rPr>
+        <w:t>Укажите, сколько вопросов получит студент.</w:t>
+      </w:r>
+    </w:p>
+    <w:p>
+      <w:pPr>
+        <w:pStyle w:val="ListNumber"/>
+      </w:pPr>
+      <w:r>
+        <w:rPr>
+          <w:rFonts w:ascii="Calibri" w:hAnsi="Calibri" w:eastAsia="Calibri"/>
+          <w:b w:val="0"/>
+          <w:sz w:val="22"/>
+        </w:rPr>
+        <w:t>Нажмите «Создать тест».</w:t>
+      </w:r>
+    </w:p>
+    <w:p>
+      <w:pPr>
+        <w:pStyle w:val="ListNumber"/>
+      </w:pPr>
+      <w:r>
+        <w:rPr>
+          <w:rFonts w:ascii="Calibri" w:hAnsi="Calibri" w:eastAsia="Calibri"/>
+          <w:b w:val="0"/>
+          <w:sz w:val="22"/>
+        </w:rPr>
+        <w:t>В курсе: Добавить → «Тесты» → выберите тест → «Добавить задание».</w:t>
+      </w:r>
+    </w:p>
+    <w:p>
+      <w:pPr>
+        <w:pStyle w:val="Heading1"/>
+      </w:pPr>
+      <w:r>
+        <w:rPr>
+          <w:rFonts w:ascii="Calibri" w:hAnsi="Calibri" w:eastAsia="Calibri"/>
+          <w:b/>
+          <w:sz w:val="36"/>
+        </w:rPr>
+        <w:t>12. Коллекция вопросов</w:t>
+      </w:r>
+    </w:p>
+    <w:p>
+      <w:pPr>
+        <w:spacing w:after="160" w:before="0"/>
+      </w:pPr>
+      <w:r>
+        <w:rPr>
+          <w:rFonts w:ascii="Calibri" w:hAnsi="Calibri" w:eastAsia="Calibri"/>
+          <w:b w:val="0"/>
+          <w:i w:val="0"/>
+          <w:sz w:val="22"/>
+        </w:rPr>
+        <w:t>Наборы вопросов для вставки в тесты. Создайте коллекцию и наполните её.</w:t>
+      </w:r>
+    </w:p>
     <w:p>
       <w:pPr>
         <w:jc w:val="center"/>
@@ -2955,7 +2698,7 @@
         <w:drawing>
           <wp:inline xmlns:a="http://schemas.openxmlformats.org/drawingml/2006/main" xmlns:pic="http://schemas.openxmlformats.org/drawingml/2006/picture">
             <wp:extent cx="5688000" cy="3555000"/>
-            <wp:docPr id="14" name="Picture 14"/>
+            <wp:docPr id="20" name="Picture 20"/>
             <wp:cNvGraphicFramePr>
               <a:graphicFrameLocks noChangeAspect="1"/>
             </wp:cNvGraphicFramePr>
@@ -2963,11 +2706,11 @@
               <a:graphicData uri="http://schemas.openxmlformats.org/drawingml/2006/picture">
                 <pic:pic>
                   <pic:nvPicPr>
-                    <pic:cNvPr id="0" name="17c-add-quiz-submit.png"/>
+                    <pic:cNvPr id="0" name="17-question-bank.png"/>
                     <pic:cNvPicPr/>
                   </pic:nvPicPr>
                   <pic:blipFill>
-                    <a:blip r:embed="rId22"/>
+                    <a:blip r:embed="rId28"/>
                     <a:stretch>
                       <a:fillRect/>
                     </a:stretch>
@@ -2998,499 +2741,7 @@
           <w:color w:val="5A5A5A"/>
           <w:sz w:val="18"/>
         </w:rPr>
-        <w:t>Рисунок 14. «Добавить вопрос», «Назад» и «Создать тест»</w:t>
-      </w:r>
-    </w:p>
-    <w:p>
-      <w:pPr>
-        <w:pStyle w:val="ListNumber"/>
-      </w:pPr>
-      <w:r>
-        <w:rPr>
-          <w:rFonts w:ascii="Calibri" w:hAnsi="Calibri" w:eastAsia="Calibri"/>
-          <w:b w:val="0"/>
-          <w:sz w:val="22"/>
-        </w:rPr>
-        <w:t>Заполните параметры теста.</w:t>
-      </w:r>
-    </w:p>
-    <w:p>
-      <w:pPr>
-        <w:pStyle w:val="ListNumber"/>
-      </w:pPr>
-      <w:r>
-        <w:rPr>
-          <w:rFonts w:ascii="Calibri" w:hAnsi="Calibri" w:eastAsia="Calibri"/>
-          <w:b w:val="0"/>
-          <w:sz w:val="22"/>
-        </w:rPr>
-        <w:t>Введите вопросы, варианты и отметьте правильные ответы.</w:t>
-      </w:r>
-    </w:p>
-    <w:p>
-      <w:pPr>
-        <w:pStyle w:val="ListNumber"/>
-      </w:pPr>
-      <w:r>
-        <w:rPr>
-          <w:rFonts w:ascii="Calibri" w:hAnsi="Calibri" w:eastAsia="Calibri"/>
-          <w:b w:val="0"/>
-          <w:sz w:val="22"/>
-        </w:rPr>
-        <w:t>При необходимости нажмите «Добавить вопрос».</w:t>
-      </w:r>
-    </w:p>
-    <w:p>
-      <w:pPr>
-        <w:pStyle w:val="ListNumber"/>
-      </w:pPr>
-      <w:r>
-        <w:rPr>
-          <w:rFonts w:ascii="Calibri" w:hAnsi="Calibri" w:eastAsia="Calibri"/>
-          <w:b w:val="0"/>
-          <w:sz w:val="22"/>
-        </w:rPr>
-        <w:t>Нажмите «Создать тест».</w:t>
-      </w:r>
-    </w:p>
-    <w:p>
-      <w:pPr>
-        <w:pStyle w:val="ListNumber"/>
-      </w:pPr>
-      <w:r>
-        <w:rPr>
-          <w:rFonts w:ascii="Calibri" w:hAnsi="Calibri" w:eastAsia="Calibri"/>
-          <w:b w:val="0"/>
-          <w:sz w:val="22"/>
-        </w:rPr>
-        <w:t>Вернитесь в курс → «Добавить» → тип «Тест» → выберите созданный тест → «Добавить задание».</w:t>
-      </w:r>
-    </w:p>
-    <w:p>
-      <w:pPr>
-        <w:pStyle w:val="Heading1"/>
-      </w:pPr>
-      <w:r>
-        <w:rPr>
-          <w:rFonts w:ascii="Calibri" w:hAnsi="Calibri" w:eastAsia="Calibri"/>
-          <w:b/>
-          <w:sz w:val="36"/>
-        </w:rPr>
-        <w:t>7. Как добавить учебные материалы</w:t>
-      </w:r>
-    </w:p>
-    <w:p>
-      <w:pPr>
-        <w:spacing w:after="160" w:before="0"/>
-      </w:pPr>
-      <w:r>
-        <w:rPr>
-          <w:rFonts w:ascii="Calibri" w:hAnsi="Calibri" w:eastAsia="Calibri"/>
-          <w:b w:val="0"/>
-          <w:i w:val="0"/>
-          <w:sz w:val="22"/>
-        </w:rPr>
-        <w:t>Материалы привязаны к конкретной теме. Сначала выберите тему слева на вкладке «Учебный процесс». Справа появится блок «Учебные материалы».</w:t>
-      </w:r>
-    </w:p>
-    <w:p>
-      <w:pPr>
-        <w:jc w:val="center"/>
-      </w:pPr>
-      <w:r>
-        <w:drawing>
-          <wp:inline xmlns:a="http://schemas.openxmlformats.org/drawingml/2006/main" xmlns:pic="http://schemas.openxmlformats.org/drawingml/2006/picture">
-            <wp:extent cx="5688000" cy="3555000"/>
-            <wp:docPr id="15" name="Picture 15"/>
-            <wp:cNvGraphicFramePr>
-              <a:graphicFrameLocks noChangeAspect="1"/>
-            </wp:cNvGraphicFramePr>
-            <a:graphic>
-              <a:graphicData uri="http://schemas.openxmlformats.org/drawingml/2006/picture">
-                <pic:pic>
-                  <pic:nvPicPr>
-                    <pic:cNvPr id="0" name="13-theme-materials.png"/>
-                    <pic:cNvPicPr/>
-                  </pic:nvPicPr>
-                  <pic:blipFill>
-                    <a:blip r:embed="rId23"/>
-                    <a:stretch>
-                      <a:fillRect/>
-                    </a:stretch>
-                  </pic:blipFill>
-                  <pic:spPr>
-                    <a:xfrm>
-                      <a:off x="0" y="0"/>
-                      <a:ext cx="5688000" cy="3555000"/>
-                    </a:xfrm>
-                    <a:prstGeom prst="rect"/>
-                  </pic:spPr>
-                </pic:pic>
-              </a:graphicData>
-            </a:graphic>
-          </wp:inline>
-        </w:drawing>
-      </w:r>
-    </w:p>
-    <w:p>
-      <w:pPr>
-        <w:spacing w:after="240"/>
-        <w:jc w:val="center"/>
-      </w:pPr>
-      <w:r>
-        <w:rPr>
-          <w:rFonts w:ascii="Calibri" w:hAnsi="Calibri" w:eastAsia="Calibri"/>
-          <w:b w:val="0"/>
-          <w:color w:val="5A5A5A"/>
-          <w:sz w:val="18"/>
-        </w:rPr>
-        <w:t>Рисунок 15. Тема выбрана: блок «Учебные материалы»</w:t>
-      </w:r>
-    </w:p>
-    <w:p>
-      <w:pPr>
-        <w:pStyle w:val="ListNumber"/>
-      </w:pPr>
-      <w:r>
-        <w:rPr>
-          <w:rFonts w:ascii="Calibri" w:hAnsi="Calibri" w:eastAsia="Calibri"/>
-          <w:b w:val="0"/>
-          <w:sz w:val="22"/>
-        </w:rPr>
-        <w:t>Откройте курс и вкладку «Учебный процесс».</w:t>
-      </w:r>
-    </w:p>
-    <w:p>
-      <w:pPr>
-        <w:pStyle w:val="ListNumber"/>
-      </w:pPr>
-      <w:r>
-        <w:rPr>
-          <w:rFonts w:ascii="Calibri" w:hAnsi="Calibri" w:eastAsia="Calibri"/>
-          <w:b w:val="0"/>
-          <w:sz w:val="22"/>
-        </w:rPr>
-        <w:t>Нажмите нужную тему слева.</w:t>
-      </w:r>
-    </w:p>
-    <w:p>
-      <w:pPr>
-        <w:pStyle w:val="ListNumber"/>
-      </w:pPr>
-      <w:r>
-        <w:rPr>
-          <w:rFonts w:ascii="Calibri" w:hAnsi="Calibri" w:eastAsia="Calibri"/>
-          <w:b w:val="0"/>
-          <w:sz w:val="22"/>
-        </w:rPr>
-        <w:t>В блоке «Учебные материалы» нажмите «Добавить материал» или перетащите файлы.</w:t>
-      </w:r>
-    </w:p>
-    <w:p>
-      <w:pPr>
-        <w:pStyle w:val="ListNumber"/>
-      </w:pPr>
-      <w:r>
-        <w:rPr>
-          <w:rFonts w:ascii="Calibri" w:hAnsi="Calibri" w:eastAsia="Calibri"/>
-          <w:b w:val="0"/>
-          <w:sz w:val="22"/>
-        </w:rPr>
-        <w:t>Откроется панель «Загрузка материала».</w:t>
-      </w:r>
-    </w:p>
-    <w:p>
-      <w:pPr>
-        <w:jc w:val="center"/>
-      </w:pPr>
-      <w:r>
-        <w:drawing>
-          <wp:inline xmlns:a="http://schemas.openxmlformats.org/drawingml/2006/main" xmlns:pic="http://schemas.openxmlformats.org/drawingml/2006/picture">
-            <wp:extent cx="5688000" cy="3555000"/>
-            <wp:docPr id="16" name="Picture 16"/>
-            <wp:cNvGraphicFramePr>
-              <a:graphicFrameLocks noChangeAspect="1"/>
-            </wp:cNvGraphicFramePr>
-            <a:graphic>
-              <a:graphicData uri="http://schemas.openxmlformats.org/drawingml/2006/picture">
-                <pic:pic>
-                  <pic:nvPicPr>
-                    <pic:cNvPr id="0" name="14-add-material-form.png"/>
-                    <pic:cNvPicPr/>
-                  </pic:nvPicPr>
-                  <pic:blipFill>
-                    <a:blip r:embed="rId24"/>
-                    <a:stretch>
-                      <a:fillRect/>
-                    </a:stretch>
-                  </pic:blipFill>
-                  <pic:spPr>
-                    <a:xfrm>
-                      <a:off x="0" y="0"/>
-                      <a:ext cx="5688000" cy="3555000"/>
-                    </a:xfrm>
-                    <a:prstGeom prst="rect"/>
-                  </pic:spPr>
-                </pic:pic>
-              </a:graphicData>
-            </a:graphic>
-          </wp:inline>
-        </w:drawing>
-      </w:r>
-    </w:p>
-    <w:p>
-      <w:pPr>
-        <w:spacing w:after="240"/>
-        <w:jc w:val="center"/>
-      </w:pPr>
-      <w:r>
-        <w:rPr>
-          <w:rFonts w:ascii="Calibri" w:hAnsi="Calibri" w:eastAsia="Calibri"/>
-          <w:b w:val="0"/>
-          <w:color w:val="5A5A5A"/>
-          <w:sz w:val="18"/>
-        </w:rPr>
-        <w:t>Рисунок 16. Панель «Загрузка материала»</w:t>
-      </w:r>
-    </w:p>
-    <w:p>
-      <w:pPr>
-        <w:pStyle w:val="Heading2"/>
-      </w:pPr>
-      <w:r>
-        <w:rPr>
-          <w:rFonts w:ascii="Calibri" w:hAnsi="Calibri" w:eastAsia="Calibri"/>
-          <w:b/>
-          <w:sz w:val="28"/>
-        </w:rPr>
-        <w:t>Поля формы «Загрузка материала»</w:t>
-      </w:r>
-    </w:p>
-    <w:tbl>
-      <w:tblPr>
-        <w:tblStyle w:val="TableGrid"/>
-        <w:tblW w:type="auto" w:w="0"/>
-        <w:tblLook w:firstColumn="1" w:firstRow="1" w:lastColumn="0" w:lastRow="0" w:noHBand="0" w:noVBand="1" w:val="04A0"/>
-      </w:tblPr>
-      <w:tblGrid>
-        <w:gridCol w:w="3324"/>
-        <w:gridCol w:w="3324"/>
-        <w:gridCol w:w="3324"/>
-      </w:tblGrid>
-      <w:tr>
-        <w:tc>
-          <w:tcPr>
-            <w:tcW w:type="dxa" w:w="3324"/>
-          </w:tcPr>
-          <w:p>
-            <w:r/>
-            <w:r>
-              <w:rPr>
-                <w:rFonts w:ascii="Calibri" w:hAnsi="Calibri" w:eastAsia="Calibri"/>
-                <w:b/>
-                <w:sz w:val="20"/>
-              </w:rPr>
-              <w:t>Поле</w:t>
-            </w:r>
-          </w:p>
-        </w:tc>
-        <w:tc>
-          <w:tcPr>
-            <w:tcW w:type="dxa" w:w="3324"/>
-          </w:tcPr>
-          <w:p>
-            <w:r/>
-            <w:r>
-              <w:rPr>
-                <w:rFonts w:ascii="Calibri" w:hAnsi="Calibri" w:eastAsia="Calibri"/>
-                <w:b/>
-                <w:sz w:val="20"/>
-              </w:rPr>
-              <w:t>Обязательно</w:t>
-            </w:r>
-          </w:p>
-        </w:tc>
-        <w:tc>
-          <w:tcPr>
-            <w:tcW w:type="dxa" w:w="3324"/>
-          </w:tcPr>
-          <w:p>
-            <w:r/>
-            <w:r>
-              <w:rPr>
-                <w:rFonts w:ascii="Calibri" w:hAnsi="Calibri" w:eastAsia="Calibri"/>
-                <w:b/>
-                <w:sz w:val="20"/>
-              </w:rPr>
-              <w:t>Описание</w:t>
-            </w:r>
-          </w:p>
-        </w:tc>
-      </w:tr>
-      <w:tr>
-        <w:tc>
-          <w:tcPr>
-            <w:tcW w:type="dxa" w:w="3324"/>
-          </w:tcPr>
-          <w:p>
-            <w:r/>
-            <w:r>
-              <w:rPr>
-                <w:rFonts w:ascii="Calibri" w:hAnsi="Calibri" w:eastAsia="Calibri"/>
-                <w:b w:val="0"/>
-                <w:sz w:val="20"/>
-              </w:rPr>
-              <w:t>Описание материала</w:t>
-            </w:r>
-          </w:p>
-        </w:tc>
-        <w:tc>
-          <w:tcPr>
-            <w:tcW w:type="dxa" w:w="3324"/>
-          </w:tcPr>
-          <w:p>
-            <w:r/>
-            <w:r>
-              <w:rPr>
-                <w:rFonts w:ascii="Calibri" w:hAnsi="Calibri" w:eastAsia="Calibri"/>
-                <w:b w:val="0"/>
-                <w:sz w:val="20"/>
-              </w:rPr>
-              <w:t>Да</w:t>
-            </w:r>
-          </w:p>
-        </w:tc>
-        <w:tc>
-          <w:tcPr>
-            <w:tcW w:type="dxa" w:w="3324"/>
-          </w:tcPr>
-          <w:p>
-            <w:r/>
-            <w:r>
-              <w:rPr>
-                <w:rFonts w:ascii="Calibri" w:hAnsi="Calibri" w:eastAsia="Calibri"/>
-                <w:b w:val="0"/>
-                <w:sz w:val="20"/>
-              </w:rPr>
-              <w:t>Как материал будет подписан для студентов.</w:t>
-            </w:r>
-          </w:p>
-        </w:tc>
-      </w:tr>
-      <w:tr>
-        <w:tc>
-          <w:tcPr>
-            <w:tcW w:type="dxa" w:w="3324"/>
-          </w:tcPr>
-          <w:p>
-            <w:r/>
-            <w:r>
-              <w:rPr>
-                <w:rFonts w:ascii="Calibri" w:hAnsi="Calibri" w:eastAsia="Calibri"/>
-                <w:b w:val="0"/>
-                <w:sz w:val="20"/>
-              </w:rPr>
-              <w:t>Ссылка на файл/видео/фото</w:t>
-            </w:r>
-          </w:p>
-        </w:tc>
-        <w:tc>
-          <w:tcPr>
-            <w:tcW w:type="dxa" w:w="3324"/>
-          </w:tcPr>
-          <w:p>
-            <w:r/>
-            <w:r>
-              <w:rPr>
-                <w:rFonts w:ascii="Calibri" w:hAnsi="Calibri" w:eastAsia="Calibri"/>
-                <w:b w:val="0"/>
-                <w:sz w:val="20"/>
-              </w:rPr>
-              <w:t>Нет*</w:t>
-            </w:r>
-          </w:p>
-        </w:tc>
-        <w:tc>
-          <w:tcPr>
-            <w:tcW w:type="dxa" w:w="3324"/>
-          </w:tcPr>
-          <w:p>
-            <w:r/>
-            <w:r>
-              <w:rPr>
-                <w:rFonts w:ascii="Calibri" w:hAnsi="Calibri" w:eastAsia="Calibri"/>
-                <w:b w:val="0"/>
-                <w:sz w:val="20"/>
-              </w:rPr>
-              <w:t>Внешняя ссылка на документ, видео или изображение.</w:t>
-            </w:r>
-          </w:p>
-        </w:tc>
-      </w:tr>
-      <w:tr>
-        <w:tc>
-          <w:tcPr>
-            <w:tcW w:type="dxa" w:w="3324"/>
-          </w:tcPr>
-          <w:p>
-            <w:r/>
-            <w:r>
-              <w:rPr>
-                <w:rFonts w:ascii="Calibri" w:hAnsi="Calibri" w:eastAsia="Calibri"/>
-                <w:b w:val="0"/>
-                <w:sz w:val="20"/>
-              </w:rPr>
-              <w:t>Материал</w:t>
-            </w:r>
-          </w:p>
-        </w:tc>
-        <w:tc>
-          <w:tcPr>
-            <w:tcW w:type="dxa" w:w="3324"/>
-          </w:tcPr>
-          <w:p>
-            <w:r/>
-            <w:r>
-              <w:rPr>
-                <w:rFonts w:ascii="Calibri" w:hAnsi="Calibri" w:eastAsia="Calibri"/>
-                <w:b w:val="0"/>
-                <w:sz w:val="20"/>
-              </w:rPr>
-              <w:t>Нет*</w:t>
-            </w:r>
-          </w:p>
-        </w:tc>
-        <w:tc>
-          <w:tcPr>
-            <w:tcW w:type="dxa" w:w="3324"/>
-          </w:tcPr>
-          <w:p>
-            <w:r/>
-            <w:r>
-              <w:rPr>
-                <w:rFonts w:ascii="Calibri" w:hAnsi="Calibri" w:eastAsia="Calibri"/>
-                <w:b w:val="0"/>
-                <w:sz w:val="20"/>
-              </w:rPr>
-              <w:t>Загрузка файла с компьютера.</w:t>
-            </w:r>
-          </w:p>
-        </w:tc>
-      </w:tr>
-    </w:tbl>
-    <w:p/>
-    <w:p>
-      <w:pPr>
-        <w:spacing w:after="160" w:before="0"/>
-      </w:pPr>
-      <w:r>
-        <w:rPr>
-          <w:rFonts w:ascii="Calibri" w:hAnsi="Calibri" w:eastAsia="Calibri"/>
-          <w:b w:val="0"/>
-          <w:i/>
-          <w:sz w:val="22"/>
-        </w:rPr>
-        <w:t>* Файл и ссылка взаимоисключающие: если выбран файл, поле ссылки скрывается, и наоборот. Нужно указать либо файл, либо ссылку. Затем нажмите «Загрузить материал».</w:t>
+        <w:t>Рисунок 20. Коллекции вопросов</w:t>
       </w:r>
     </w:p>
     <w:p>
@@ -3516,7 +2767,7 @@
           <w:b w:val="0"/>
           <w:sz w:val="22"/>
         </w:rPr>
-        <w:t>Войдите логином и паролем UNET, профиль «Сотрудник».</w:t>
+        <w:t>Войдите логином UNET, профиль «Сотрудник».</w:t>
       </w:r>
     </w:p>
     <w:p>
@@ -3529,7 +2780,7 @@
           <w:b w:val="0"/>
           <w:sz w:val="22"/>
         </w:rPr>
-        <w:t>Создайте курс: дисциплина, кредиты, форма контроля.</w:t>
+        <w:t>Создайте курс: название и кафедра.</w:t>
       </w:r>
     </w:p>
     <w:p>
@@ -3542,7 +2793,7 @@
           <w:b w:val="0"/>
           <w:sz w:val="22"/>
         </w:rPr>
-        <w:t>Откройте курс через «Подробнее».</w:t>
+        <w:t>Откройте курс, создайте приглашение или добавьте поток.</w:t>
       </w:r>
     </w:p>
     <w:p>
@@ -3555,7 +2806,7 @@
           <w:b w:val="0"/>
           <w:sz w:val="22"/>
         </w:rPr>
-        <w:t>Добавьте темы (лекция, практика, лабораторная, СРС).</w:t>
+        <w:t>Добавьте темы.</w:t>
       </w:r>
     </w:p>
     <w:p>
@@ -3568,7 +2819,7 @@
           <w:b w:val="0"/>
           <w:sz w:val="22"/>
         </w:rPr>
-        <w:t>При необходимости создайте тест в разделе «Тестирование» и привяжите его к курсу.</w:t>
+        <w:t>При необходимости создайте тест и привяжите его к курсу.</w:t>
       </w:r>
     </w:p>
     <w:p>
@@ -3581,7 +2832,20 @@
           <w:b w:val="0"/>
           <w:sz w:val="22"/>
         </w:rPr>
-        <w:t>Выберите тему и загрузите учебные материалы.</w:t>
+        <w:t>Загрузите материалы в тему.</w:t>
+      </w:r>
+    </w:p>
+    <w:p>
+      <w:pPr>
+        <w:pStyle w:val="ListNumber"/>
+      </w:pPr>
+      <w:r>
+        <w:rPr>
+          <w:rFonts w:ascii="Calibri" w:hAnsi="Calibri" w:eastAsia="Calibri"/>
+          <w:b w:val="0"/>
+          <w:sz w:val="22"/>
+        </w:rPr>
+        <w:t>Проверяйте сдачи на «Сегодня» и смотрите успеваемость.</w:t>
       </w:r>
     </w:p>
     <w:sectPr>

</xml_diff>